<commit_message>
feat(methodichka): add Chapter 10 (labyrinth) to detailed DOCX
- build_metodichka_docx.py: add build_ch10() and register in build_docx()
  with TOC entry. Covers: idea/data format, DFS maze generation, graph
  conversion, search wrapper, ASCII viz, Blender scene, A*/Dijkstra
  comparison table, tests summary, extension ideas
- Методичка_подробная.docx: append Chapter 10 to existing DOCX
  (preserving embedded image) and insert TOC row between Глава 9
  and Приложение А
- методичка_подробная.md: sync structural cleanup and Chapter 10
</commit_message>
<xml_diff>
--- a/docs/metodichka/Методичка_подробная.docx
+++ b/docs/metodichka/Методичка_подробная.docx
@@ -733,6 +733,28 @@
           <w:lang w:val="ru-RU"/>
         </w:rPr>
         <w:t>Оформление результата: отчёт и презентация</w:t>
+      </w:r>
+    </w:p>
+    <w:p>
+      <w:pPr>
+        <w:spacing w:before="60" w:after="60" w:line="240" w:lineRule="auto"/>
+        <w:rPr>
+          <w:lang w:val="ru-RU"/>
+        </w:rPr>
+      </w:pPr>
+      <w:r>
+        <w:rPr>
+          <w:b/>
+          <w:color w:val="16213E"/>
+          <w:lang w:val="ru-RU"/>
+        </w:rPr>
+        <w:t xml:space="preserve">Глава 10.  </w:t>
+      </w:r>
+      <w:r>
+        <w:rPr>
+          <w:lang w:val="ru-RU"/>
+        </w:rPr>
+        <w:t>Лабиринт: один и тот же движок на 2D</w:t>
       </w:r>
     </w:p>
     <w:p>
@@ -21768,6 +21790,2595 @@
           <w:lang w:val="ru-RU"/>
         </w:rPr>
         <w:t>Граф, где каждый узел соединён с 8 соседями (вкл. диагонали)</w:t>
+      </w:r>
+    </w:p>
+    <w:p>
+      <w:pPr>
+        <w:keepNext/>
+        <w:spacing w:before="480" w:after="160"/>
+      </w:pPr>
+      <w:r>
+        <w:rPr>
+          <w:b/>
+          <w:color w:val="1A1A2E"/>
+          <w:sz w:val="36"/>
+        </w:rPr>
+        <w:t>Глава 10. Лабиринт: один и тот же движок на 2D</w:t>
+      </w:r>
+    </w:p>
+    <w:p>
+      <w:pPr>
+        <w:spacing w:before="80" w:after="80"/>
+        <w:pBdr>
+          <w:bottom w:val="single" w:sz="6" w:space="1" w:color="C0C8D8"/>
+        </w:pBdr>
+      </w:pPr>
+    </w:p>
+    <w:p>
+      <w:pPr>
+        <w:spacing w:before="60" w:after="120"/>
+        <w:ind w:firstLine="425"/>
+      </w:pPr>
+      <w:r>
+        <w:rPr>
+          <w:sz w:val="22"/>
+        </w:rPr>
+        <w:t xml:space="preserve">В главе 6 мы искали путь на 3D-поверхности z = f(x, y). Теперь покажем, что </w:t>
+      </w:r>
+      <w:r>
+        <w:rPr>
+          <w:b/>
+          <w:sz w:val="22"/>
+        </w:rPr>
+        <w:t>тот же самый движок</w:t>
+      </w:r>
+      <w:r>
+        <w:rPr>
+          <w:sz w:val="22"/>
+        </w:rPr>
+        <w:t xml:space="preserve"> (TerrainGraph + A* / Dijkstra) работает и на плоском лабиринте — без единой строчки изменений в самих алгоритмах. Ключевая идея: у рельефа и у лабиринта </w:t>
+      </w:r>
+      <w:r>
+        <w:rPr>
+          <w:b/>
+          <w:sz w:val="22"/>
+        </w:rPr>
+        <w:t>общий формат данных</w:t>
+      </w:r>
+      <w:r>
+        <w:rPr>
+          <w:sz w:val="22"/>
+        </w:rPr>
+        <w:t xml:space="preserve"> — 2D-массив ячеек.</w:t>
+      </w:r>
+    </w:p>
+    <w:p>
+      <w:pPr>
+        <w:keepNext/>
+        <w:spacing w:before="320" w:after="120"/>
+      </w:pPr>
+      <w:r>
+        <w:rPr>
+          <w:b/>
+          <w:color w:val="16213E"/>
+          <w:sz w:val="28"/>
+        </w:rPr>
+        <w:t>10.1 Идея и формат данных</w:t>
+      </w:r>
+    </w:p>
+    <w:p>
+      <w:pPr>
+        <w:spacing w:before="60" w:after="120"/>
+        <w:ind w:firstLine="425"/>
+      </w:pPr>
+      <w:r>
+        <w:rPr>
+          <w:sz w:val="22"/>
+        </w:rPr>
+        <w:t>И рельеф, и лабиринт сводятся к матрице H[rows][cols]. В рельефе в ячейках лежит высота z; в лабиринте — только два значения:</w:t>
+      </w:r>
+    </w:p>
+    <w:p>
+      <w:pPr>
+        <w:pStyle w:val="a0"/>
+        <w:spacing w:before="40" w:after="40"/>
+        <w:ind w:left="425"/>
+      </w:pPr>
+      <w:r>
+        <w:rPr>
+          <w:sz w:val="22"/>
+        </w:rPr>
+        <w:t>0 — свободная ячейка (проход)</w:t>
+      </w:r>
+    </w:p>
+    <w:p>
+      <w:pPr>
+        <w:pStyle w:val="a0"/>
+        <w:spacing w:before="40" w:after="40"/>
+        <w:ind w:left="425"/>
+      </w:pPr>
+      <w:r>
+        <w:rPr>
+          <w:sz w:val="22"/>
+        </w:rPr>
+        <w:t>1 — стена</w:t>
+      </w:r>
+    </w:p>
+    <w:p>
+      <w:pPr>
+        <w:spacing w:before="60" w:after="120"/>
+        <w:ind w:firstLine="425"/>
+      </w:pPr>
+      <w:r>
+        <w:rPr>
+          <w:sz w:val="22"/>
+        </w:rPr>
+        <w:t>Функция maze_to_terrain_graph превращает эту матрицу в плоский TerrainGraph (z = 0 во всех точках) и помечает стены как blocked=True. Дальше — обычный вызов a_star или dijkstra из модуля pathfinding.search.</w:t>
+      </w:r>
+    </w:p>
+    <w:p>
+      <w:pPr>
+        <w:spacing w:before="160" w:after="160"/>
+        <w:ind w:left="283" w:right="283"/>
+        <w:shd w:val="clear" w:color="auto" w:fill="FFF8DC"/>
+      </w:pPr>
+      <w:r>
+        <w:rPr>
+          <w:b/>
+          <w:color w:val="7A5C00"/>
+          <w:sz w:val="20"/>
+        </w:rPr>
+        <w:t xml:space="preserve">📌 Для преподавателя:  </w:t>
+      </w:r>
+      <w:r>
+        <w:rPr>
+          <w:color w:val="4A3C00"/>
+          <w:sz w:val="20"/>
+        </w:rPr>
+        <w:t>Важный педагогический момент: студенты видят, что алгоритмы поиска пути НЕ знают ни про рельеф, ни про лабиринт. Они работают с абстрактным графом. Меняется только способ построения графа — сама логика A* и Dijkstra остаётся.</w:t>
+      </w:r>
+    </w:p>
+    <w:p>
+      <w:pPr>
+        <w:keepNext/>
+        <w:spacing w:before="320" w:after="120"/>
+      </w:pPr>
+      <w:r>
+        <w:rPr>
+          <w:b/>
+          <w:color w:val="16213E"/>
+          <w:sz w:val="28"/>
+        </w:rPr>
+        <w:t>10.2 Генерация лабиринта (DFS с откатом)</w:t>
+      </w:r>
+    </w:p>
+    <w:p>
+      <w:pPr>
+        <w:spacing w:before="60" w:after="120"/>
+        <w:ind w:firstLine="425"/>
+      </w:pPr>
+      <w:r>
+        <w:rPr>
+          <w:sz w:val="22"/>
+        </w:rPr>
+        <w:t>Используем классический алгоритм «рекурсивного обхода» (recursive backtracking), реализованный итеративно через стек — чтобы не упираться в лимит рекурсии Python на больших лабиринтах. Для воспроизводимости принимаем параметр seed: одинаковый seed → одинаковый лабиринт.</w:t>
+      </w:r>
+    </w:p>
+    <w:p>
+      <w:pPr>
+        <w:spacing w:before="200" w:after="0"/>
+      </w:pPr>
+      <w:r>
+        <w:rPr>
+          <w:i/>
+          <w:color w:val="556677"/>
+          <w:sz w:val="18"/>
+        </w:rPr>
+        <w:t xml:space="preserve">  scripts/pathfinding/labyrinth.py — generate_maze</w:t>
+      </w:r>
+    </w:p>
+    <w:p>
+      <w:pPr>
+        <w:spacing w:before="0" w:after="0"/>
+        <w:ind w:left="283" w:right="283"/>
+        <w:shd w:val="clear" w:color="auto" w:fill="EEF2F8"/>
+      </w:pPr>
+      <w:r>
+        <w:rPr>
+          <w:rFonts w:ascii="Courier New" w:hAnsi="Courier New"/>
+          <w:color w:val="1E3A5F"/>
+          <w:sz w:val="18"/>
+        </w:rPr>
+        <w:t>def generate_maze(rows: int, cols: int, seed: int | None = None) -&gt; MazeGrid:</w:t>
+      </w:r>
+    </w:p>
+    <w:p>
+      <w:pPr>
+        <w:spacing w:before="0" w:after="0"/>
+        <w:ind w:left="283" w:right="283"/>
+        <w:shd w:val="clear" w:color="auto" w:fill="EEF2F8"/>
+      </w:pPr>
+      <w:r>
+        <w:rPr>
+          <w:rFonts w:ascii="Courier New" w:hAnsi="Courier New"/>
+          <w:color w:val="1E3A5F"/>
+          <w:sz w:val="18"/>
+        </w:rPr>
+        <w:t xml:space="preserve">    # Чётные размеры округляем до нечётных — чтобы корректно легли стены.</w:t>
+      </w:r>
+    </w:p>
+    <w:p>
+      <w:pPr>
+        <w:spacing w:before="0" w:after="0"/>
+        <w:ind w:left="283" w:right="283"/>
+        <w:shd w:val="clear" w:color="auto" w:fill="EEF2F8"/>
+      </w:pPr>
+      <w:r>
+        <w:rPr>
+          <w:rFonts w:ascii="Courier New" w:hAnsi="Courier New"/>
+          <w:color w:val="1E3A5F"/>
+          <w:sz w:val="18"/>
+        </w:rPr>
+        <w:t xml:space="preserve">    if rows % 2 == 0: rows += 1</w:t>
+      </w:r>
+    </w:p>
+    <w:p>
+      <w:pPr>
+        <w:spacing w:before="0" w:after="0"/>
+        <w:ind w:left="283" w:right="283"/>
+        <w:shd w:val="clear" w:color="auto" w:fill="EEF2F8"/>
+      </w:pPr>
+      <w:r>
+        <w:rPr>
+          <w:rFonts w:ascii="Courier New" w:hAnsi="Courier New"/>
+          <w:color w:val="1E3A5F"/>
+          <w:sz w:val="18"/>
+        </w:rPr>
+        <w:t xml:space="preserve">    if cols % 2 == 0: cols += 1</w:t>
+      </w:r>
+    </w:p>
+    <w:p>
+      <w:pPr>
+        <w:spacing w:before="0" w:after="0"/>
+        <w:ind w:left="283" w:right="283"/>
+        <w:shd w:val="clear" w:color="auto" w:fill="EEF2F8"/>
+      </w:pPr>
+      <w:r>
+        <w:rPr>
+          <w:rFonts w:ascii="Courier New" w:hAnsi="Courier New"/>
+          <w:color w:val="1E3A5F"/>
+          <w:sz w:val="18"/>
+        </w:rPr>
+        <w:t xml:space="preserve"> </w:t>
+      </w:r>
+    </w:p>
+    <w:p>
+      <w:pPr>
+        <w:spacing w:before="0" w:after="0"/>
+        <w:ind w:left="283" w:right="283"/>
+        <w:shd w:val="clear" w:color="auto" w:fill="EEF2F8"/>
+      </w:pPr>
+      <w:r>
+        <w:rPr>
+          <w:rFonts w:ascii="Courier New" w:hAnsi="Courier New"/>
+          <w:color w:val="1E3A5F"/>
+          <w:sz w:val="18"/>
+        </w:rPr>
+        <w:t xml:space="preserve">    rng = random.Random(seed)</w:t>
+      </w:r>
+    </w:p>
+    <w:p>
+      <w:pPr>
+        <w:spacing w:before="0" w:after="0"/>
+        <w:ind w:left="283" w:right="283"/>
+        <w:shd w:val="clear" w:color="auto" w:fill="EEF2F8"/>
+      </w:pPr>
+      <w:r>
+        <w:rPr>
+          <w:rFonts w:ascii="Courier New" w:hAnsi="Courier New"/>
+          <w:color w:val="1E3A5F"/>
+          <w:sz w:val="18"/>
+        </w:rPr>
+        <w:t xml:space="preserve">    maze = [[WALL for _ in range(cols)] for _ in range(rows)]</w:t>
+      </w:r>
+    </w:p>
+    <w:p>
+      <w:pPr>
+        <w:spacing w:before="0" w:after="0"/>
+        <w:ind w:left="283" w:right="283"/>
+        <w:shd w:val="clear" w:color="auto" w:fill="EEF2F8"/>
+      </w:pPr>
+      <w:r>
+        <w:rPr>
+          <w:rFonts w:ascii="Courier New" w:hAnsi="Courier New"/>
+          <w:color w:val="1E3A5F"/>
+          <w:sz w:val="18"/>
+        </w:rPr>
+        <w:t xml:space="preserve"> </w:t>
+      </w:r>
+    </w:p>
+    <w:p>
+      <w:pPr>
+        <w:spacing w:before="0" w:after="0"/>
+        <w:ind w:left="283" w:right="283"/>
+        <w:shd w:val="clear" w:color="auto" w:fill="EEF2F8"/>
+      </w:pPr>
+      <w:r>
+        <w:rPr>
+          <w:rFonts w:ascii="Courier New" w:hAnsi="Courier New"/>
+          <w:color w:val="1E3A5F"/>
+          <w:sz w:val="18"/>
+        </w:rPr>
+        <w:t xml:space="preserve">    # Стартуем с (1, 1), прорубаем по 2 клетки за шаг.</w:t>
+      </w:r>
+    </w:p>
+    <w:p>
+      <w:pPr>
+        <w:spacing w:before="0" w:after="0"/>
+        <w:ind w:left="283" w:right="283"/>
+        <w:shd w:val="clear" w:color="auto" w:fill="EEF2F8"/>
+      </w:pPr>
+      <w:r>
+        <w:rPr>
+          <w:rFonts w:ascii="Courier New" w:hAnsi="Courier New"/>
+          <w:color w:val="1E3A5F"/>
+          <w:sz w:val="18"/>
+        </w:rPr>
+        <w:t xml:space="preserve">    stack = [(1, 1)]</w:t>
+      </w:r>
+    </w:p>
+    <w:p>
+      <w:pPr>
+        <w:spacing w:before="0" w:after="0"/>
+        <w:ind w:left="283" w:right="283"/>
+        <w:shd w:val="clear" w:color="auto" w:fill="EEF2F8"/>
+      </w:pPr>
+      <w:r>
+        <w:rPr>
+          <w:rFonts w:ascii="Courier New" w:hAnsi="Courier New"/>
+          <w:color w:val="1E3A5F"/>
+          <w:sz w:val="18"/>
+        </w:rPr>
+        <w:t xml:space="preserve">    maze[1][1] = FREE</w:t>
+      </w:r>
+    </w:p>
+    <w:p>
+      <w:pPr>
+        <w:spacing w:before="0" w:after="0"/>
+        <w:ind w:left="283" w:right="283"/>
+        <w:shd w:val="clear" w:color="auto" w:fill="EEF2F8"/>
+      </w:pPr>
+      <w:r>
+        <w:rPr>
+          <w:rFonts w:ascii="Courier New" w:hAnsi="Courier New"/>
+          <w:color w:val="1E3A5F"/>
+          <w:sz w:val="18"/>
+        </w:rPr>
+        <w:t xml:space="preserve">    while stack:</w:t>
+      </w:r>
+    </w:p>
+    <w:p>
+      <w:pPr>
+        <w:spacing w:before="0" w:after="0"/>
+        <w:ind w:left="283" w:right="283"/>
+        <w:shd w:val="clear" w:color="auto" w:fill="EEF2F8"/>
+      </w:pPr>
+      <w:r>
+        <w:rPr>
+          <w:rFonts w:ascii="Courier New" w:hAnsi="Courier New"/>
+          <w:color w:val="1E3A5F"/>
+          <w:sz w:val="18"/>
+        </w:rPr>
+        <w:t xml:space="preserve">        r, c = stack[-1]</w:t>
+      </w:r>
+    </w:p>
+    <w:p>
+      <w:pPr>
+        <w:spacing w:before="0" w:after="0"/>
+        <w:ind w:left="283" w:right="283"/>
+        <w:shd w:val="clear" w:color="auto" w:fill="EEF2F8"/>
+      </w:pPr>
+      <w:r>
+        <w:rPr>
+          <w:rFonts w:ascii="Courier New" w:hAnsi="Courier New"/>
+          <w:color w:val="1E3A5F"/>
+          <w:sz w:val="18"/>
+        </w:rPr>
+        <w:t xml:space="preserve">        neighbours = []</w:t>
+      </w:r>
+    </w:p>
+    <w:p>
+      <w:pPr>
+        <w:spacing w:before="0" w:after="0"/>
+        <w:ind w:left="283" w:right="283"/>
+        <w:shd w:val="clear" w:color="auto" w:fill="EEF2F8"/>
+      </w:pPr>
+      <w:r>
+        <w:rPr>
+          <w:rFonts w:ascii="Courier New" w:hAnsi="Courier New"/>
+          <w:color w:val="1E3A5F"/>
+          <w:sz w:val="18"/>
+        </w:rPr>
+        <w:t xml:space="preserve">        for dr, dc in ((-2, 0), (2, 0), (0, -2), (0, 2)):</w:t>
+      </w:r>
+    </w:p>
+    <w:p>
+      <w:pPr>
+        <w:spacing w:before="0" w:after="0"/>
+        <w:ind w:left="283" w:right="283"/>
+        <w:shd w:val="clear" w:color="auto" w:fill="EEF2F8"/>
+      </w:pPr>
+      <w:r>
+        <w:rPr>
+          <w:rFonts w:ascii="Courier New" w:hAnsi="Courier New"/>
+          <w:color w:val="1E3A5F"/>
+          <w:sz w:val="18"/>
+        </w:rPr>
+        <w:t xml:space="preserve">            nr, nc = r + dr, c + dc</w:t>
+      </w:r>
+    </w:p>
+    <w:p>
+      <w:pPr>
+        <w:spacing w:before="0" w:after="0"/>
+        <w:ind w:left="283" w:right="283"/>
+        <w:shd w:val="clear" w:color="auto" w:fill="EEF2F8"/>
+      </w:pPr>
+      <w:r>
+        <w:rPr>
+          <w:rFonts w:ascii="Courier New" w:hAnsi="Courier New"/>
+          <w:color w:val="1E3A5F"/>
+          <w:sz w:val="18"/>
+        </w:rPr>
+        <w:t xml:space="preserve">            if 0 &lt; nr &lt; rows - 1 and 0 &lt; nc &lt; cols - 1 and maze[nr][nc] == WALL:</w:t>
+      </w:r>
+    </w:p>
+    <w:p>
+      <w:pPr>
+        <w:spacing w:before="0" w:after="0"/>
+        <w:ind w:left="283" w:right="283"/>
+        <w:shd w:val="clear" w:color="auto" w:fill="EEF2F8"/>
+      </w:pPr>
+      <w:r>
+        <w:rPr>
+          <w:rFonts w:ascii="Courier New" w:hAnsi="Courier New"/>
+          <w:color w:val="1E3A5F"/>
+          <w:sz w:val="18"/>
+        </w:rPr>
+        <w:t xml:space="preserve">                neighbours.append((nr, nc, dr, dc))</w:t>
+      </w:r>
+    </w:p>
+    <w:p>
+      <w:pPr>
+        <w:spacing w:before="0" w:after="0"/>
+        <w:ind w:left="283" w:right="283"/>
+        <w:shd w:val="clear" w:color="auto" w:fill="EEF2F8"/>
+      </w:pPr>
+      <w:r>
+        <w:rPr>
+          <w:rFonts w:ascii="Courier New" w:hAnsi="Courier New"/>
+          <w:color w:val="1E3A5F"/>
+          <w:sz w:val="18"/>
+        </w:rPr>
+        <w:t xml:space="preserve">        if not neighbours:</w:t>
+      </w:r>
+    </w:p>
+    <w:p>
+      <w:pPr>
+        <w:spacing w:before="0" w:after="0"/>
+        <w:ind w:left="283" w:right="283"/>
+        <w:shd w:val="clear" w:color="auto" w:fill="EEF2F8"/>
+      </w:pPr>
+      <w:r>
+        <w:rPr>
+          <w:rFonts w:ascii="Courier New" w:hAnsi="Courier New"/>
+          <w:color w:val="1E3A5F"/>
+          <w:sz w:val="18"/>
+        </w:rPr>
+        <w:t xml:space="preserve">            stack.pop()</w:t>
+      </w:r>
+    </w:p>
+    <w:p>
+      <w:pPr>
+        <w:spacing w:before="0" w:after="0"/>
+        <w:ind w:left="283" w:right="283"/>
+        <w:shd w:val="clear" w:color="auto" w:fill="EEF2F8"/>
+      </w:pPr>
+      <w:r>
+        <w:rPr>
+          <w:rFonts w:ascii="Courier New" w:hAnsi="Courier New"/>
+          <w:color w:val="1E3A5F"/>
+          <w:sz w:val="18"/>
+        </w:rPr>
+        <w:t xml:space="preserve">            continue</w:t>
+      </w:r>
+    </w:p>
+    <w:p>
+      <w:pPr>
+        <w:spacing w:before="0" w:after="0"/>
+        <w:ind w:left="283" w:right="283"/>
+        <w:shd w:val="clear" w:color="auto" w:fill="EEF2F8"/>
+      </w:pPr>
+      <w:r>
+        <w:rPr>
+          <w:rFonts w:ascii="Courier New" w:hAnsi="Courier New"/>
+          <w:color w:val="1E3A5F"/>
+          <w:sz w:val="18"/>
+        </w:rPr>
+        <w:t xml:space="preserve">        nr, nc, dr, dc = rng.choice(neighbours)</w:t>
+      </w:r>
+    </w:p>
+    <w:p>
+      <w:pPr>
+        <w:spacing w:before="0" w:after="0"/>
+        <w:ind w:left="283" w:right="283"/>
+        <w:shd w:val="clear" w:color="auto" w:fill="EEF2F8"/>
+      </w:pPr>
+      <w:r>
+        <w:rPr>
+          <w:rFonts w:ascii="Courier New" w:hAnsi="Courier New"/>
+          <w:color w:val="1E3A5F"/>
+          <w:sz w:val="18"/>
+        </w:rPr>
+        <w:t xml:space="preserve">        maze[r + dr // 2][c + dc // 2] = FREE  # пробиваем стену между клетками</w:t>
+      </w:r>
+    </w:p>
+    <w:p>
+      <w:pPr>
+        <w:spacing w:before="0" w:after="0"/>
+        <w:ind w:left="283" w:right="283"/>
+        <w:shd w:val="clear" w:color="auto" w:fill="EEF2F8"/>
+      </w:pPr>
+      <w:r>
+        <w:rPr>
+          <w:rFonts w:ascii="Courier New" w:hAnsi="Courier New"/>
+          <w:color w:val="1E3A5F"/>
+          <w:sz w:val="18"/>
+        </w:rPr>
+        <w:t xml:space="preserve">        maze[nr][nc] = FREE</w:t>
+      </w:r>
+    </w:p>
+    <w:p>
+      <w:pPr>
+        <w:spacing w:before="0" w:after="0"/>
+        <w:ind w:left="283" w:right="283"/>
+        <w:shd w:val="clear" w:color="auto" w:fill="EEF2F8"/>
+      </w:pPr>
+      <w:r>
+        <w:rPr>
+          <w:rFonts w:ascii="Courier New" w:hAnsi="Courier New"/>
+          <w:color w:val="1E3A5F"/>
+          <w:sz w:val="18"/>
+        </w:rPr>
+        <w:t xml:space="preserve">        stack.append((nr, nc))</w:t>
+      </w:r>
+    </w:p>
+    <w:p>
+      <w:pPr>
+        <w:spacing w:before="0" w:after="0"/>
+        <w:ind w:left="283" w:right="283"/>
+        <w:shd w:val="clear" w:color="auto" w:fill="EEF2F8"/>
+      </w:pPr>
+      <w:r>
+        <w:rPr>
+          <w:rFonts w:ascii="Courier New" w:hAnsi="Courier New"/>
+          <w:color w:val="1E3A5F"/>
+          <w:sz w:val="18"/>
+        </w:rPr>
+        <w:t xml:space="preserve">    return maze</w:t>
+      </w:r>
+    </w:p>
+    <w:p>
+      <w:pPr>
+        <w:spacing w:after="80"/>
+      </w:pPr>
+    </w:p>
+    <w:p>
+      <w:pPr>
+        <w:spacing w:before="60" w:after="120"/>
+        <w:ind w:firstLine="425"/>
+      </w:pPr>
+      <w:r>
+        <w:rPr>
+          <w:sz w:val="22"/>
+        </w:rPr>
+        <w:t>Результат: «идеальный» лабиринт — между любыми двумя клетками существует ровно один путь, циклов нет. Это ключевое свойство, на котором строится сравнение A* и Dijkstra в §10.7.</w:t>
+      </w:r>
+    </w:p>
+    <w:p>
+      <w:pPr>
+        <w:keepNext/>
+        <w:spacing w:before="320" w:after="120"/>
+      </w:pPr>
+      <w:r>
+        <w:rPr>
+          <w:b/>
+          <w:color w:val="16213E"/>
+          <w:sz w:val="28"/>
+        </w:rPr>
+        <w:t>10.3 Перенос лабиринта в TerrainGraph</w:t>
+      </w:r>
+    </w:p>
+    <w:p>
+      <w:pPr>
+        <w:spacing w:before="60" w:after="120"/>
+        <w:ind w:firstLine="425"/>
+      </w:pPr>
+      <w:r>
+        <w:rPr>
+          <w:sz w:val="22"/>
+        </w:rPr>
+        <w:t>TerrainGraph уже умеет работать с заблокированными ячейками. Нам осталось только заполнить массив высот нулями и пробросить маску стен:</w:t>
+      </w:r>
+    </w:p>
+    <w:p>
+      <w:pPr>
+        <w:spacing w:before="200" w:after="0"/>
+      </w:pPr>
+      <w:r>
+        <w:rPr>
+          <w:i/>
+          <w:color w:val="556677"/>
+          <w:sz w:val="18"/>
+        </w:rPr>
+        <w:t xml:space="preserve">  scripts/pathfinding/labyrinth.py — maze_to_terrain_graph</w:t>
+      </w:r>
+    </w:p>
+    <w:p>
+      <w:pPr>
+        <w:spacing w:before="0" w:after="0"/>
+        <w:ind w:left="283" w:right="283"/>
+        <w:shd w:val="clear" w:color="auto" w:fill="EEF2F8"/>
+      </w:pPr>
+      <w:r>
+        <w:rPr>
+          <w:rFonts w:ascii="Courier New" w:hAnsi="Courier New"/>
+          <w:color w:val="1E3A5F"/>
+          <w:sz w:val="18"/>
+        </w:rPr>
+        <w:t>def maze_to_terrain_graph(maze: MazeGrid, *, cell_size: float = 1.0,</w:t>
+      </w:r>
+    </w:p>
+    <w:p>
+      <w:pPr>
+        <w:spacing w:before="0" w:after="0"/>
+        <w:ind w:left="283" w:right="283"/>
+        <w:shd w:val="clear" w:color="auto" w:fill="EEF2F8"/>
+      </w:pPr>
+      <w:r>
+        <w:rPr>
+          <w:rFonts w:ascii="Courier New" w:hAnsi="Courier New"/>
+          <w:color w:val="1E3A5F"/>
+          <w:sz w:val="18"/>
+        </w:rPr>
+        <w:t xml:space="preserve">                          connectivity: int = 4) -&gt; TerrainGraph:</w:t>
+      </w:r>
+    </w:p>
+    <w:p>
+      <w:pPr>
+        <w:spacing w:before="0" w:after="0"/>
+        <w:ind w:left="283" w:right="283"/>
+        <w:shd w:val="clear" w:color="auto" w:fill="EEF2F8"/>
+      </w:pPr>
+      <w:r>
+        <w:rPr>
+          <w:rFonts w:ascii="Courier New" w:hAnsi="Courier New"/>
+          <w:color w:val="1E3A5F"/>
+          <w:sz w:val="18"/>
+        </w:rPr>
+        <w:t xml:space="preserve">    rows = len(maze)</w:t>
+      </w:r>
+    </w:p>
+    <w:p>
+      <w:pPr>
+        <w:spacing w:before="0" w:after="0"/>
+        <w:ind w:left="283" w:right="283"/>
+        <w:shd w:val="clear" w:color="auto" w:fill="EEF2F8"/>
+      </w:pPr>
+      <w:r>
+        <w:rPr>
+          <w:rFonts w:ascii="Courier New" w:hAnsi="Courier New"/>
+          <w:color w:val="1E3A5F"/>
+          <w:sz w:val="18"/>
+        </w:rPr>
+        <w:t xml:space="preserve">    cols = len(maze[0])</w:t>
+      </w:r>
+    </w:p>
+    <w:p>
+      <w:pPr>
+        <w:spacing w:before="0" w:after="0"/>
+        <w:ind w:left="283" w:right="283"/>
+        <w:shd w:val="clear" w:color="auto" w:fill="EEF2F8"/>
+      </w:pPr>
+      <w:r>
+        <w:rPr>
+          <w:rFonts w:ascii="Courier New" w:hAnsi="Courier New"/>
+          <w:color w:val="1E3A5F"/>
+          <w:sz w:val="18"/>
+        </w:rPr>
+        <w:t xml:space="preserve">    heights = [[0.0] * cols for _ in range(rows)]</w:t>
+      </w:r>
+    </w:p>
+    <w:p>
+      <w:pPr>
+        <w:spacing w:before="0" w:after="0"/>
+        <w:ind w:left="283" w:right="283"/>
+        <w:shd w:val="clear" w:color="auto" w:fill="EEF2F8"/>
+      </w:pPr>
+      <w:r>
+        <w:rPr>
+          <w:rFonts w:ascii="Courier New" w:hAnsi="Courier New"/>
+          <w:color w:val="1E3A5F"/>
+          <w:sz w:val="18"/>
+        </w:rPr>
+        <w:t xml:space="preserve">    blocked = [[cell == WALL for cell in row] for row in maze]</w:t>
+      </w:r>
+    </w:p>
+    <w:p>
+      <w:pPr>
+        <w:spacing w:before="0" w:after="0"/>
+        <w:ind w:left="283" w:right="283"/>
+        <w:shd w:val="clear" w:color="auto" w:fill="EEF2F8"/>
+      </w:pPr>
+      <w:r>
+        <w:rPr>
+          <w:rFonts w:ascii="Courier New" w:hAnsi="Courier New"/>
+          <w:color w:val="1E3A5F"/>
+          <w:sz w:val="18"/>
+        </w:rPr>
+        <w:t xml:space="preserve">    return TerrainGraph(</w:t>
+      </w:r>
+    </w:p>
+    <w:p>
+      <w:pPr>
+        <w:spacing w:before="0" w:after="0"/>
+        <w:ind w:left="283" w:right="283"/>
+        <w:shd w:val="clear" w:color="auto" w:fill="EEF2F8"/>
+      </w:pPr>
+      <w:r>
+        <w:rPr>
+          <w:rFonts w:ascii="Courier New" w:hAnsi="Courier New"/>
+          <w:color w:val="1E3A5F"/>
+          <w:sz w:val="18"/>
+        </w:rPr>
+        <w:t xml:space="preserve">        heights=heights,</w:t>
+      </w:r>
+    </w:p>
+    <w:p>
+      <w:pPr>
+        <w:spacing w:before="0" w:after="0"/>
+        <w:ind w:left="283" w:right="283"/>
+        <w:shd w:val="clear" w:color="auto" w:fill="EEF2F8"/>
+      </w:pPr>
+      <w:r>
+        <w:rPr>
+          <w:rFonts w:ascii="Courier New" w:hAnsi="Courier New"/>
+          <w:color w:val="1E3A5F"/>
+          <w:sz w:val="18"/>
+        </w:rPr>
+        <w:t xml:space="preserve">        cell_size=cell_size,</w:t>
+      </w:r>
+    </w:p>
+    <w:p>
+      <w:pPr>
+        <w:spacing w:before="0" w:after="0"/>
+        <w:ind w:left="283" w:right="283"/>
+        <w:shd w:val="clear" w:color="auto" w:fill="EEF2F8"/>
+      </w:pPr>
+      <w:r>
+        <w:rPr>
+          <w:rFonts w:ascii="Courier New" w:hAnsi="Courier New"/>
+          <w:color w:val="1E3A5F"/>
+          <w:sz w:val="18"/>
+        </w:rPr>
+        <w:t xml:space="preserve">        connectivity=connectivity,  # 4 — без диагоналей, как принято в лабиринтах</w:t>
+      </w:r>
+    </w:p>
+    <w:p>
+      <w:pPr>
+        <w:spacing w:before="0" w:after="0"/>
+        <w:ind w:left="283" w:right="283"/>
+        <w:shd w:val="clear" w:color="auto" w:fill="EEF2F8"/>
+      </w:pPr>
+      <w:r>
+        <w:rPr>
+          <w:rFonts w:ascii="Courier New" w:hAnsi="Courier New"/>
+          <w:color w:val="1E3A5F"/>
+          <w:sz w:val="18"/>
+        </w:rPr>
+        <w:t xml:space="preserve">        blocked=blocked,</w:t>
+      </w:r>
+    </w:p>
+    <w:p>
+      <w:pPr>
+        <w:spacing w:before="0" w:after="0"/>
+        <w:ind w:left="283" w:right="283"/>
+        <w:shd w:val="clear" w:color="auto" w:fill="EEF2F8"/>
+      </w:pPr>
+      <w:r>
+        <w:rPr>
+          <w:rFonts w:ascii="Courier New" w:hAnsi="Courier New"/>
+          <w:color w:val="1E3A5F"/>
+          <w:sz w:val="18"/>
+        </w:rPr>
+        <w:t xml:space="preserve">    )</w:t>
+      </w:r>
+    </w:p>
+    <w:p>
+      <w:pPr>
+        <w:spacing w:after="80"/>
+      </w:pPr>
+    </w:p>
+    <w:p>
+      <w:pPr>
+        <w:keepNext/>
+        <w:spacing w:before="320" w:after="120"/>
+      </w:pPr>
+      <w:r>
+        <w:rPr>
+          <w:b/>
+          <w:color w:val="16213E"/>
+          <w:sz w:val="28"/>
+        </w:rPr>
+        <w:t>10.4 Поиск пути</w:t>
+      </w:r>
+    </w:p>
+    <w:p>
+      <w:pPr>
+        <w:spacing w:before="60" w:after="120"/>
+        <w:ind w:firstLine="425"/>
+      </w:pPr>
+      <w:r>
+        <w:rPr>
+          <w:sz w:val="22"/>
+        </w:rPr>
+        <w:t>Тонкая обёртка — строит граф и вызывает нужный алгоритм. Возвращает штатный SearchResult из pathfinding.search, то есть path, visited_nodes, cost — абсолютно так же, как и для рельефа.</w:t>
+      </w:r>
+    </w:p>
+    <w:p>
+      <w:pPr>
+        <w:spacing w:before="200" w:after="0"/>
+      </w:pPr>
+      <w:r>
+        <w:rPr>
+          <w:i/>
+          <w:color w:val="556677"/>
+          <w:sz w:val="18"/>
+        </w:rPr>
+        <w:t xml:space="preserve">  scripts/pathfinding/labyrinth.py — find_path_in_maze</w:t>
+      </w:r>
+    </w:p>
+    <w:p>
+      <w:pPr>
+        <w:spacing w:before="0" w:after="0"/>
+        <w:ind w:left="283" w:right="283"/>
+        <w:shd w:val="clear" w:color="auto" w:fill="EEF2F8"/>
+      </w:pPr>
+      <w:r>
+        <w:rPr>
+          <w:rFonts w:ascii="Courier New" w:hAnsi="Courier New"/>
+          <w:color w:val="1E3A5F"/>
+          <w:sz w:val="18"/>
+        </w:rPr>
+        <w:t>def find_path_in_maze(maze, start, goal, *, algorithm: str = "astar",</w:t>
+      </w:r>
+    </w:p>
+    <w:p>
+      <w:pPr>
+        <w:spacing w:before="0" w:after="0"/>
+        <w:ind w:left="283" w:right="283"/>
+        <w:shd w:val="clear" w:color="auto" w:fill="EEF2F8"/>
+      </w:pPr>
+      <w:r>
+        <w:rPr>
+          <w:rFonts w:ascii="Courier New" w:hAnsi="Courier New"/>
+          <w:color w:val="1E3A5F"/>
+          <w:sz w:val="18"/>
+        </w:rPr>
+        <w:t xml:space="preserve">                      cell_size: float = 1.0, connectivity: int = 4,</w:t>
+      </w:r>
+    </w:p>
+    <w:p>
+      <w:pPr>
+        <w:spacing w:before="0" w:after="0"/>
+        <w:ind w:left="283" w:right="283"/>
+        <w:shd w:val="clear" w:color="auto" w:fill="EEF2F8"/>
+      </w:pPr>
+      <w:r>
+        <w:rPr>
+          <w:rFonts w:ascii="Courier New" w:hAnsi="Courier New"/>
+          <w:color w:val="1E3A5F"/>
+          <w:sz w:val="18"/>
+        </w:rPr>
+        <w:t xml:space="preserve">                      weights: Weights | None = None) -&gt; SearchResult:</w:t>
+      </w:r>
+    </w:p>
+    <w:p>
+      <w:pPr>
+        <w:spacing w:before="0" w:after="0"/>
+        <w:ind w:left="283" w:right="283"/>
+        <w:shd w:val="clear" w:color="auto" w:fill="EEF2F8"/>
+      </w:pPr>
+      <w:r>
+        <w:rPr>
+          <w:rFonts w:ascii="Courier New" w:hAnsi="Courier New"/>
+          <w:color w:val="1E3A5F"/>
+          <w:sz w:val="18"/>
+        </w:rPr>
+        <w:t xml:space="preserve">    graph = maze_to_terrain_graph(maze, cell_size=cell_size,</w:t>
+      </w:r>
+    </w:p>
+    <w:p>
+      <w:pPr>
+        <w:spacing w:before="0" w:after="0"/>
+        <w:ind w:left="283" w:right="283"/>
+        <w:shd w:val="clear" w:color="auto" w:fill="EEF2F8"/>
+      </w:pPr>
+      <w:r>
+        <w:rPr>
+          <w:rFonts w:ascii="Courier New" w:hAnsi="Courier New"/>
+          <w:color w:val="1E3A5F"/>
+          <w:sz w:val="18"/>
+        </w:rPr>
+        <w:t xml:space="preserve">                                  connectivity=connectivity)</w:t>
+      </w:r>
+    </w:p>
+    <w:p>
+      <w:pPr>
+        <w:spacing w:before="0" w:after="0"/>
+        <w:ind w:left="283" w:right="283"/>
+        <w:shd w:val="clear" w:color="auto" w:fill="EEF2F8"/>
+      </w:pPr>
+      <w:r>
+        <w:rPr>
+          <w:rFonts w:ascii="Courier New" w:hAnsi="Courier New"/>
+          <w:color w:val="1E3A5F"/>
+          <w:sz w:val="18"/>
+        </w:rPr>
+        <w:t xml:space="preserve">    weights = weights or Weights(w_length=1.0, w_slope=0.0, w_risk=0.0)</w:t>
+      </w:r>
+    </w:p>
+    <w:p>
+      <w:pPr>
+        <w:spacing w:before="0" w:after="0"/>
+        <w:ind w:left="283" w:right="283"/>
+        <w:shd w:val="clear" w:color="auto" w:fill="EEF2F8"/>
+      </w:pPr>
+      <w:r>
+        <w:rPr>
+          <w:rFonts w:ascii="Courier New" w:hAnsi="Courier New"/>
+          <w:color w:val="1E3A5F"/>
+          <w:sz w:val="18"/>
+        </w:rPr>
+        <w:t xml:space="preserve">    if algorithm == "astar":</w:t>
+      </w:r>
+    </w:p>
+    <w:p>
+      <w:pPr>
+        <w:spacing w:before="0" w:after="0"/>
+        <w:ind w:left="283" w:right="283"/>
+        <w:shd w:val="clear" w:color="auto" w:fill="EEF2F8"/>
+      </w:pPr>
+      <w:r>
+        <w:rPr>
+          <w:rFonts w:ascii="Courier New" w:hAnsi="Courier New"/>
+          <w:color w:val="1E3A5F"/>
+          <w:sz w:val="18"/>
+        </w:rPr>
+        <w:t xml:space="preserve">        return a_star(graph, start, goal, weights=weights)</w:t>
+      </w:r>
+    </w:p>
+    <w:p>
+      <w:pPr>
+        <w:spacing w:before="0" w:after="0"/>
+        <w:ind w:left="283" w:right="283"/>
+        <w:shd w:val="clear" w:color="auto" w:fill="EEF2F8"/>
+      </w:pPr>
+      <w:r>
+        <w:rPr>
+          <w:rFonts w:ascii="Courier New" w:hAnsi="Courier New"/>
+          <w:color w:val="1E3A5F"/>
+          <w:sz w:val="18"/>
+        </w:rPr>
+        <w:t xml:space="preserve">    if algorithm == "dijkstra":</w:t>
+      </w:r>
+    </w:p>
+    <w:p>
+      <w:pPr>
+        <w:spacing w:before="0" w:after="0"/>
+        <w:ind w:left="283" w:right="283"/>
+        <w:shd w:val="clear" w:color="auto" w:fill="EEF2F8"/>
+      </w:pPr>
+      <w:r>
+        <w:rPr>
+          <w:rFonts w:ascii="Courier New" w:hAnsi="Courier New"/>
+          <w:color w:val="1E3A5F"/>
+          <w:sz w:val="18"/>
+        </w:rPr>
+        <w:t xml:space="preserve">        return dijkstra(graph, start, goal, weights=weights)</w:t>
+      </w:r>
+    </w:p>
+    <w:p>
+      <w:pPr>
+        <w:spacing w:before="0" w:after="0"/>
+        <w:ind w:left="283" w:right="283"/>
+        <w:shd w:val="clear" w:color="auto" w:fill="EEF2F8"/>
+      </w:pPr>
+      <w:r>
+        <w:rPr>
+          <w:rFonts w:ascii="Courier New" w:hAnsi="Courier New"/>
+          <w:color w:val="1E3A5F"/>
+          <w:sz w:val="18"/>
+        </w:rPr>
+        <w:t xml:space="preserve">    raise ValueError(f"Неизвестный алгоритм: {algorithm}")</w:t>
+      </w:r>
+    </w:p>
+    <w:p>
+      <w:pPr>
+        <w:spacing w:after="80"/>
+      </w:pPr>
+    </w:p>
+    <w:p>
+      <w:pPr>
+        <w:keepNext/>
+        <w:spacing w:before="320" w:after="120"/>
+      </w:pPr>
+      <w:r>
+        <w:rPr>
+          <w:b/>
+          <w:color w:val="16213E"/>
+          <w:sz w:val="28"/>
+        </w:rPr>
+        <w:t>10.5 ASCII-визуализация</w:t>
+      </w:r>
+    </w:p>
+    <w:p>
+      <w:pPr>
+        <w:spacing w:before="60" w:after="120"/>
+        <w:ind w:firstLine="425"/>
+      </w:pPr>
+      <w:r>
+        <w:rPr>
+          <w:sz w:val="22"/>
+        </w:rPr>
+        <w:t>Перед тем, как строить сцену в Blender, удобно посмотреть результат прямо в терминале. Функция print_maze рендерит лабиринт и путь через Unicode-символы:</w:t>
+      </w:r>
+    </w:p>
+    <w:p>
+      <w:pPr>
+        <w:spacing w:before="200" w:after="0"/>
+      </w:pPr>
+      <w:r>
+        <w:rPr>
+          <w:i/>
+          <w:color w:val="556677"/>
+          <w:sz w:val="18"/>
+        </w:rPr>
+        <w:t xml:space="preserve">  Минимальный запуск без Blender</w:t>
+      </w:r>
+    </w:p>
+    <w:p>
+      <w:pPr>
+        <w:spacing w:before="0" w:after="0"/>
+        <w:ind w:left="283" w:right="283"/>
+        <w:shd w:val="clear" w:color="auto" w:fill="EEF2F8"/>
+      </w:pPr>
+      <w:r>
+        <w:rPr>
+          <w:rFonts w:ascii="Courier New" w:hAnsi="Courier New"/>
+          <w:color w:val="1E3A5F"/>
+          <w:sz w:val="18"/>
+        </w:rPr>
+        <w:t>import sys; sys.path.insert(0, "scripts")</w:t>
+      </w:r>
+    </w:p>
+    <w:p>
+      <w:pPr>
+        <w:spacing w:before="0" w:after="0"/>
+        <w:ind w:left="283" w:right="283"/>
+        <w:shd w:val="clear" w:color="auto" w:fill="EEF2F8"/>
+      </w:pPr>
+      <w:r>
+        <w:rPr>
+          <w:rFonts w:ascii="Courier New" w:hAnsi="Courier New"/>
+          <w:color w:val="1E3A5F"/>
+          <w:sz w:val="18"/>
+        </w:rPr>
+        <w:t>from pathfinding.labyrinth import (</w:t>
+      </w:r>
+    </w:p>
+    <w:p>
+      <w:pPr>
+        <w:spacing w:before="0" w:after="0"/>
+        <w:ind w:left="283" w:right="283"/>
+        <w:shd w:val="clear" w:color="auto" w:fill="EEF2F8"/>
+      </w:pPr>
+      <w:r>
+        <w:rPr>
+          <w:rFonts w:ascii="Courier New" w:hAnsi="Courier New"/>
+          <w:color w:val="1E3A5F"/>
+          <w:sz w:val="18"/>
+        </w:rPr>
+        <w:t xml:space="preserve">    generate_maze, find_path_in_maze, maze_start_goal, print_maze,</w:t>
+      </w:r>
+    </w:p>
+    <w:p>
+      <w:pPr>
+        <w:spacing w:before="0" w:after="0"/>
+        <w:ind w:left="283" w:right="283"/>
+        <w:shd w:val="clear" w:color="auto" w:fill="EEF2F8"/>
+      </w:pPr>
+      <w:r>
+        <w:rPr>
+          <w:rFonts w:ascii="Courier New" w:hAnsi="Courier New"/>
+          <w:color w:val="1E3A5F"/>
+          <w:sz w:val="18"/>
+        </w:rPr>
+        <w:t>)</w:t>
+      </w:r>
+    </w:p>
+    <w:p>
+      <w:pPr>
+        <w:spacing w:before="0" w:after="0"/>
+        <w:ind w:left="283" w:right="283"/>
+        <w:shd w:val="clear" w:color="auto" w:fill="EEF2F8"/>
+      </w:pPr>
+      <w:r>
+        <w:rPr>
+          <w:rFonts w:ascii="Courier New" w:hAnsi="Courier New"/>
+          <w:color w:val="1E3A5F"/>
+          <w:sz w:val="18"/>
+        </w:rPr>
+        <w:t xml:space="preserve"> </w:t>
+      </w:r>
+    </w:p>
+    <w:p>
+      <w:pPr>
+        <w:spacing w:before="0" w:after="0"/>
+        <w:ind w:left="283" w:right="283"/>
+        <w:shd w:val="clear" w:color="auto" w:fill="EEF2F8"/>
+      </w:pPr>
+      <w:r>
+        <w:rPr>
+          <w:rFonts w:ascii="Courier New" w:hAnsi="Courier New"/>
+          <w:color w:val="1E3A5F"/>
+          <w:sz w:val="18"/>
+        </w:rPr>
+        <w:t>maze = generate_maze(rows=21, cols=21, seed=42)</w:t>
+      </w:r>
+    </w:p>
+    <w:p>
+      <w:pPr>
+        <w:spacing w:before="0" w:after="0"/>
+        <w:ind w:left="283" w:right="283"/>
+        <w:shd w:val="clear" w:color="auto" w:fill="EEF2F8"/>
+      </w:pPr>
+      <w:r>
+        <w:rPr>
+          <w:rFonts w:ascii="Courier New" w:hAnsi="Courier New"/>
+          <w:color w:val="1E3A5F"/>
+          <w:sz w:val="18"/>
+        </w:rPr>
+        <w:t>start, goal = maze_start_goal(maze)</w:t>
+      </w:r>
+    </w:p>
+    <w:p>
+      <w:pPr>
+        <w:spacing w:before="0" w:after="0"/>
+        <w:ind w:left="283" w:right="283"/>
+        <w:shd w:val="clear" w:color="auto" w:fill="EEF2F8"/>
+      </w:pPr>
+      <w:r>
+        <w:rPr>
+          <w:rFonts w:ascii="Courier New" w:hAnsi="Courier New"/>
+          <w:color w:val="1E3A5F"/>
+          <w:sz w:val="18"/>
+        </w:rPr>
+        <w:t>result = find_path_in_maze(maze, start, goal, algorithm="astar")</w:t>
+      </w:r>
+    </w:p>
+    <w:p>
+      <w:pPr>
+        <w:spacing w:before="0" w:after="0"/>
+        <w:ind w:left="283" w:right="283"/>
+        <w:shd w:val="clear" w:color="auto" w:fill="EEF2F8"/>
+      </w:pPr>
+      <w:r>
+        <w:rPr>
+          <w:rFonts w:ascii="Courier New" w:hAnsi="Courier New"/>
+          <w:color w:val="1E3A5F"/>
+          <w:sz w:val="18"/>
+        </w:rPr>
+        <w:t>print(f"Путь: {len(result.path)} ячеек, посещено {result.visited_nodes}")</w:t>
+      </w:r>
+    </w:p>
+    <w:p>
+      <w:pPr>
+        <w:spacing w:before="0" w:after="0"/>
+        <w:ind w:left="283" w:right="283"/>
+        <w:shd w:val="clear" w:color="auto" w:fill="EEF2F8"/>
+      </w:pPr>
+      <w:r>
+        <w:rPr>
+          <w:rFonts w:ascii="Courier New" w:hAnsi="Courier New"/>
+          <w:color w:val="1E3A5F"/>
+          <w:sz w:val="18"/>
+        </w:rPr>
+        <w:t>print_maze(maze, path=result.path, start=start, goal=goal)</w:t>
+      </w:r>
+    </w:p>
+    <w:p>
+      <w:pPr>
+        <w:spacing w:after="80"/>
+      </w:pPr>
+    </w:p>
+    <w:p>
+      <w:pPr>
+        <w:spacing w:before="60" w:after="120"/>
+        <w:ind w:firstLine="425"/>
+      </w:pPr>
+      <w:r>
+        <w:rPr>
+          <w:sz w:val="22"/>
+        </w:rPr>
+        <w:t>Повторный запуск с тем же seed=42 даст ровно тот же лабиринт и тот же путь — это требование воспроизводимости из ТЗ проекта (§12.5 AI_AGENT_HANDOFF).</w:t>
+      </w:r>
+    </w:p>
+    <w:p>
+      <w:pPr>
+        <w:keepNext/>
+        <w:spacing w:before="320" w:after="120"/>
+      </w:pPr>
+      <w:r>
+        <w:rPr>
+          <w:b/>
+          <w:color w:val="16213E"/>
+          <w:sz w:val="28"/>
+        </w:rPr>
+        <w:t>10.6 Сцена в Blender</w:t>
+      </w:r>
+    </w:p>
+    <w:p>
+      <w:pPr>
+        <w:spacing w:before="60" w:after="120"/>
+        <w:ind w:firstLine="425"/>
+      </w:pPr>
+      <w:r>
+        <w:rPr>
+          <w:sz w:val="22"/>
+        </w:rPr>
+        <w:t>Скрипт scripts/pathfinding/visualize_labyrinth_in_blender.py собирает сцену из четырёх типов объектов:</w:t>
+      </w:r>
+    </w:p>
+    <w:p>
+      <w:pPr>
+        <w:pStyle w:val="a"/>
+        <w:spacing w:before="40" w:after="40"/>
+        <w:ind w:left="425"/>
+      </w:pPr>
+      <w:r>
+        <w:rPr>
+          <w:sz w:val="22"/>
+        </w:rPr>
+        <w:t>Плоский пол — Plane размером rows×cols</w:t>
+      </w:r>
+    </w:p>
+    <w:p>
+      <w:pPr>
+        <w:pStyle w:val="a"/>
+        <w:spacing w:before="40" w:after="40"/>
+        <w:ind w:left="425"/>
+      </w:pPr>
+      <w:r>
+        <w:rPr>
+          <w:sz w:val="22"/>
+        </w:rPr>
+        <w:t>Стены — один объединённый mesh со всеми кубиками (быстро, меньше объектов в сцене)</w:t>
+      </w:r>
+    </w:p>
+    <w:p>
+      <w:pPr>
+        <w:pStyle w:val="a"/>
+        <w:spacing w:before="40" w:after="40"/>
+        <w:ind w:left="425"/>
+      </w:pPr>
+      <w:r>
+        <w:rPr>
+          <w:sz w:val="22"/>
+        </w:rPr>
+        <w:t>Маршрут — Curve с эмиссионным материалом (светится)</w:t>
+      </w:r>
+    </w:p>
+    <w:p>
+      <w:pPr>
+        <w:pStyle w:val="a"/>
+        <w:spacing w:before="40" w:after="40"/>
+        <w:ind w:left="425"/>
+      </w:pPr>
+      <w:r>
+        <w:rPr>
+          <w:sz w:val="22"/>
+        </w:rPr>
+        <w:t>Маркеры START/GOAL — сферы зелёного и жёлтого цвета</w:t>
+      </w:r>
+    </w:p>
+    <w:p>
+      <w:pPr>
+        <w:spacing w:before="60" w:after="120"/>
+        <w:ind w:firstLine="425"/>
+      </w:pPr>
+      <w:r>
+        <w:rPr>
+          <w:sz w:val="22"/>
+        </w:rPr>
+        <w:t>Ключевой фрагмент — построение меша стен. Вместо сотни отдельных кубиков мы собираем все вершины и грани в один массив и вызываем mesh.from_pydata() один раз. На лабиринте 41×41 это быстрее в десятки раз:</w:t>
+      </w:r>
+    </w:p>
+    <w:p>
+      <w:pPr>
+        <w:spacing w:before="200" w:after="0"/>
+      </w:pPr>
+      <w:r>
+        <w:rPr>
+          <w:i/>
+          <w:color w:val="556677"/>
+          <w:sz w:val="18"/>
+        </w:rPr>
+        <w:t xml:space="preserve">  scripts/pathfinding/visualize_labyrinth_in_blender.py — build_walls_mesh</w:t>
+      </w:r>
+    </w:p>
+    <w:p>
+      <w:pPr>
+        <w:spacing w:before="0" w:after="0"/>
+        <w:ind w:left="283" w:right="283"/>
+        <w:shd w:val="clear" w:color="auto" w:fill="EEF2F8"/>
+      </w:pPr>
+      <w:r>
+        <w:rPr>
+          <w:rFonts w:ascii="Courier New" w:hAnsi="Courier New"/>
+          <w:color w:val="1E3A5F"/>
+          <w:sz w:val="18"/>
+        </w:rPr>
+        <w:t>def build_walls_mesh(maze, *, cell_size: float, wall_height: float):</w:t>
+      </w:r>
+    </w:p>
+    <w:p>
+      <w:pPr>
+        <w:spacing w:before="0" w:after="0"/>
+        <w:ind w:left="283" w:right="283"/>
+        <w:shd w:val="clear" w:color="auto" w:fill="EEF2F8"/>
+      </w:pPr>
+      <w:r>
+        <w:rPr>
+          <w:rFonts w:ascii="Courier New" w:hAnsi="Courier New"/>
+          <w:color w:val="1E3A5F"/>
+          <w:sz w:val="18"/>
+        </w:rPr>
+        <w:t xml:space="preserve">    verts, faces = [], []</w:t>
+      </w:r>
+    </w:p>
+    <w:p>
+      <w:pPr>
+        <w:spacing w:before="0" w:after="0"/>
+        <w:ind w:left="283" w:right="283"/>
+        <w:shd w:val="clear" w:color="auto" w:fill="EEF2F8"/>
+      </w:pPr>
+      <w:r>
+        <w:rPr>
+          <w:rFonts w:ascii="Courier New" w:hAnsi="Courier New"/>
+          <w:color w:val="1E3A5F"/>
+          <w:sz w:val="18"/>
+        </w:rPr>
+        <w:t xml:space="preserve">    for r, row in enumerate(maze):</w:t>
+      </w:r>
+    </w:p>
+    <w:p>
+      <w:pPr>
+        <w:spacing w:before="0" w:after="0"/>
+        <w:ind w:left="283" w:right="283"/>
+        <w:shd w:val="clear" w:color="auto" w:fill="EEF2F8"/>
+      </w:pPr>
+      <w:r>
+        <w:rPr>
+          <w:rFonts w:ascii="Courier New" w:hAnsi="Courier New"/>
+          <w:color w:val="1E3A5F"/>
+          <w:sz w:val="18"/>
+        </w:rPr>
+        <w:t xml:space="preserve">        for c, cell in enumerate(row):</w:t>
+      </w:r>
+    </w:p>
+    <w:p>
+      <w:pPr>
+        <w:spacing w:before="0" w:after="0"/>
+        <w:ind w:left="283" w:right="283"/>
+        <w:shd w:val="clear" w:color="auto" w:fill="EEF2F8"/>
+      </w:pPr>
+      <w:r>
+        <w:rPr>
+          <w:rFonts w:ascii="Courier New" w:hAnsi="Courier New"/>
+          <w:color w:val="1E3A5F"/>
+          <w:sz w:val="18"/>
+        </w:rPr>
+        <w:t xml:space="preserve">            if cell != WALL:</w:t>
+      </w:r>
+    </w:p>
+    <w:p>
+      <w:pPr>
+        <w:spacing w:before="0" w:after="0"/>
+        <w:ind w:left="283" w:right="283"/>
+        <w:shd w:val="clear" w:color="auto" w:fill="EEF2F8"/>
+      </w:pPr>
+      <w:r>
+        <w:rPr>
+          <w:rFonts w:ascii="Courier New" w:hAnsi="Courier New"/>
+          <w:color w:val="1E3A5F"/>
+          <w:sz w:val="18"/>
+        </w:rPr>
+        <w:t xml:space="preserve">                continue</w:t>
+      </w:r>
+    </w:p>
+    <w:p>
+      <w:pPr>
+        <w:spacing w:before="0" w:after="0"/>
+        <w:ind w:left="283" w:right="283"/>
+        <w:shd w:val="clear" w:color="auto" w:fill="EEF2F8"/>
+      </w:pPr>
+      <w:r>
+        <w:rPr>
+          <w:rFonts w:ascii="Courier New" w:hAnsi="Courier New"/>
+          <w:color w:val="1E3A5F"/>
+          <w:sz w:val="18"/>
+        </w:rPr>
+        <w:t xml:space="preserve">            x = (c - len(row) / 2) * cell_size</w:t>
+      </w:r>
+    </w:p>
+    <w:p>
+      <w:pPr>
+        <w:spacing w:before="0" w:after="0"/>
+        <w:ind w:left="283" w:right="283"/>
+        <w:shd w:val="clear" w:color="auto" w:fill="EEF2F8"/>
+      </w:pPr>
+      <w:r>
+        <w:rPr>
+          <w:rFonts w:ascii="Courier New" w:hAnsi="Courier New"/>
+          <w:color w:val="1E3A5F"/>
+          <w:sz w:val="18"/>
+        </w:rPr>
+        <w:t xml:space="preserve">            y = (r - len(maze) / 2) * cell_size</w:t>
+      </w:r>
+    </w:p>
+    <w:p>
+      <w:pPr>
+        <w:spacing w:before="0" w:after="0"/>
+        <w:ind w:left="283" w:right="283"/>
+        <w:shd w:val="clear" w:color="auto" w:fill="EEF2F8"/>
+      </w:pPr>
+      <w:r>
+        <w:rPr>
+          <w:rFonts w:ascii="Courier New" w:hAnsi="Courier New"/>
+          <w:color w:val="1E3A5F"/>
+          <w:sz w:val="18"/>
+        </w:rPr>
+        <w:t xml:space="preserve">            base = len(verts)</w:t>
+      </w:r>
+    </w:p>
+    <w:p>
+      <w:pPr>
+        <w:spacing w:before="0" w:after="0"/>
+        <w:ind w:left="283" w:right="283"/>
+        <w:shd w:val="clear" w:color="auto" w:fill="EEF2F8"/>
+      </w:pPr>
+      <w:r>
+        <w:rPr>
+          <w:rFonts w:ascii="Courier New" w:hAnsi="Courier New"/>
+          <w:color w:val="1E3A5F"/>
+          <w:sz w:val="18"/>
+        </w:rPr>
+        <w:t xml:space="preserve">            # 8 вершин кубика</w:t>
+      </w:r>
+    </w:p>
+    <w:p>
+      <w:pPr>
+        <w:spacing w:before="0" w:after="0"/>
+        <w:ind w:left="283" w:right="283"/>
+        <w:shd w:val="clear" w:color="auto" w:fill="EEF2F8"/>
+      </w:pPr>
+      <w:r>
+        <w:rPr>
+          <w:rFonts w:ascii="Courier New" w:hAnsi="Courier New"/>
+          <w:color w:val="1E3A5F"/>
+          <w:sz w:val="18"/>
+        </w:rPr>
+        <w:t xml:space="preserve">            for dx in (0, cell_size):</w:t>
+      </w:r>
+    </w:p>
+    <w:p>
+      <w:pPr>
+        <w:spacing w:before="0" w:after="0"/>
+        <w:ind w:left="283" w:right="283"/>
+        <w:shd w:val="clear" w:color="auto" w:fill="EEF2F8"/>
+      </w:pPr>
+      <w:r>
+        <w:rPr>
+          <w:rFonts w:ascii="Courier New" w:hAnsi="Courier New"/>
+          <w:color w:val="1E3A5F"/>
+          <w:sz w:val="18"/>
+        </w:rPr>
+        <w:t xml:space="preserve">                for dy in (0, cell_size):</w:t>
+      </w:r>
+    </w:p>
+    <w:p>
+      <w:pPr>
+        <w:spacing w:before="0" w:after="0"/>
+        <w:ind w:left="283" w:right="283"/>
+        <w:shd w:val="clear" w:color="auto" w:fill="EEF2F8"/>
+      </w:pPr>
+      <w:r>
+        <w:rPr>
+          <w:rFonts w:ascii="Courier New" w:hAnsi="Courier New"/>
+          <w:color w:val="1E3A5F"/>
+          <w:sz w:val="18"/>
+        </w:rPr>
+        <w:t xml:space="preserve">                    for dz in (0, wall_height):</w:t>
+      </w:r>
+    </w:p>
+    <w:p>
+      <w:pPr>
+        <w:spacing w:before="0" w:after="0"/>
+        <w:ind w:left="283" w:right="283"/>
+        <w:shd w:val="clear" w:color="auto" w:fill="EEF2F8"/>
+      </w:pPr>
+      <w:r>
+        <w:rPr>
+          <w:rFonts w:ascii="Courier New" w:hAnsi="Courier New"/>
+          <w:color w:val="1E3A5F"/>
+          <w:sz w:val="18"/>
+        </w:rPr>
+        <w:t xml:space="preserve">                        verts.append((x + dx, y + dy, dz))</w:t>
+      </w:r>
+    </w:p>
+    <w:p>
+      <w:pPr>
+        <w:spacing w:before="0" w:after="0"/>
+        <w:ind w:left="283" w:right="283"/>
+        <w:shd w:val="clear" w:color="auto" w:fill="EEF2F8"/>
+      </w:pPr>
+      <w:r>
+        <w:rPr>
+          <w:rFonts w:ascii="Courier New" w:hAnsi="Courier New"/>
+          <w:color w:val="1E3A5F"/>
+          <w:sz w:val="18"/>
+        </w:rPr>
+        <w:t xml:space="preserve">            # 6 граней (по 4 вершины)</w:t>
+      </w:r>
+    </w:p>
+    <w:p>
+      <w:pPr>
+        <w:spacing w:before="0" w:after="0"/>
+        <w:ind w:left="283" w:right="283"/>
+        <w:shd w:val="clear" w:color="auto" w:fill="EEF2F8"/>
+      </w:pPr>
+      <w:r>
+        <w:rPr>
+          <w:rFonts w:ascii="Courier New" w:hAnsi="Courier New"/>
+          <w:color w:val="1E3A5F"/>
+          <w:sz w:val="18"/>
+        </w:rPr>
+        <w:t xml:space="preserve">            faces.extend([</w:t>
+      </w:r>
+    </w:p>
+    <w:p>
+      <w:pPr>
+        <w:spacing w:before="0" w:after="0"/>
+        <w:ind w:left="283" w:right="283"/>
+        <w:shd w:val="clear" w:color="auto" w:fill="EEF2F8"/>
+      </w:pPr>
+      <w:r>
+        <w:rPr>
+          <w:rFonts w:ascii="Courier New" w:hAnsi="Courier New"/>
+          <w:color w:val="1E3A5F"/>
+          <w:sz w:val="18"/>
+        </w:rPr>
+        <w:t xml:space="preserve">                (base+0, base+1, base+3, base+2),  # нижняя</w:t>
+      </w:r>
+    </w:p>
+    <w:p>
+      <w:pPr>
+        <w:spacing w:before="0" w:after="0"/>
+        <w:ind w:left="283" w:right="283"/>
+        <w:shd w:val="clear" w:color="auto" w:fill="EEF2F8"/>
+      </w:pPr>
+      <w:r>
+        <w:rPr>
+          <w:rFonts w:ascii="Courier New" w:hAnsi="Courier New"/>
+          <w:color w:val="1E3A5F"/>
+          <w:sz w:val="18"/>
+        </w:rPr>
+        <w:t xml:space="preserve">                (base+4, base+6, base+7, base+5),  # верхняя</w:t>
+      </w:r>
+    </w:p>
+    <w:p>
+      <w:pPr>
+        <w:spacing w:before="0" w:after="0"/>
+        <w:ind w:left="283" w:right="283"/>
+        <w:shd w:val="clear" w:color="auto" w:fill="EEF2F8"/>
+      </w:pPr>
+      <w:r>
+        <w:rPr>
+          <w:rFonts w:ascii="Courier New" w:hAnsi="Courier New"/>
+          <w:color w:val="1E3A5F"/>
+          <w:sz w:val="18"/>
+        </w:rPr>
+        <w:t xml:space="preserve">                (base+0, base+4, base+5, base+1),  # передняя</w:t>
+      </w:r>
+    </w:p>
+    <w:p>
+      <w:pPr>
+        <w:spacing w:before="0" w:after="0"/>
+        <w:ind w:left="283" w:right="283"/>
+        <w:shd w:val="clear" w:color="auto" w:fill="EEF2F8"/>
+      </w:pPr>
+      <w:r>
+        <w:rPr>
+          <w:rFonts w:ascii="Courier New" w:hAnsi="Courier New"/>
+          <w:color w:val="1E3A5F"/>
+          <w:sz w:val="18"/>
+        </w:rPr>
+        <w:t xml:space="preserve">                (base+2, base+3, base+7, base+6),  # задняя</w:t>
+      </w:r>
+    </w:p>
+    <w:p>
+      <w:pPr>
+        <w:spacing w:before="0" w:after="0"/>
+        <w:ind w:left="283" w:right="283"/>
+        <w:shd w:val="clear" w:color="auto" w:fill="EEF2F8"/>
+      </w:pPr>
+      <w:r>
+        <w:rPr>
+          <w:rFonts w:ascii="Courier New" w:hAnsi="Courier New"/>
+          <w:color w:val="1E3A5F"/>
+          <w:sz w:val="18"/>
+        </w:rPr>
+        <w:t xml:space="preserve">                (base+0, base+2, base+6, base+4),  # левая</w:t>
+      </w:r>
+    </w:p>
+    <w:p>
+      <w:pPr>
+        <w:spacing w:before="0" w:after="0"/>
+        <w:ind w:left="283" w:right="283"/>
+        <w:shd w:val="clear" w:color="auto" w:fill="EEF2F8"/>
+      </w:pPr>
+      <w:r>
+        <w:rPr>
+          <w:rFonts w:ascii="Courier New" w:hAnsi="Courier New"/>
+          <w:color w:val="1E3A5F"/>
+          <w:sz w:val="18"/>
+        </w:rPr>
+        <w:t xml:space="preserve">                (base+1, base+5, base+7, base+3),  # правая</w:t>
+      </w:r>
+    </w:p>
+    <w:p>
+      <w:pPr>
+        <w:spacing w:before="0" w:after="0"/>
+        <w:ind w:left="283" w:right="283"/>
+        <w:shd w:val="clear" w:color="auto" w:fill="EEF2F8"/>
+      </w:pPr>
+      <w:r>
+        <w:rPr>
+          <w:rFonts w:ascii="Courier New" w:hAnsi="Courier New"/>
+          <w:color w:val="1E3A5F"/>
+          <w:sz w:val="18"/>
+        </w:rPr>
+        <w:t xml:space="preserve">            ])</w:t>
+      </w:r>
+    </w:p>
+    <w:p>
+      <w:pPr>
+        <w:spacing w:before="0" w:after="0"/>
+        <w:ind w:left="283" w:right="283"/>
+        <w:shd w:val="clear" w:color="auto" w:fill="EEF2F8"/>
+      </w:pPr>
+      <w:r>
+        <w:rPr>
+          <w:rFonts w:ascii="Courier New" w:hAnsi="Courier New"/>
+          <w:color w:val="1E3A5F"/>
+          <w:sz w:val="18"/>
+        </w:rPr>
+        <w:t xml:space="preserve">    mesh = bpy.data.meshes.new("MazeWalls")</w:t>
+      </w:r>
+    </w:p>
+    <w:p>
+      <w:pPr>
+        <w:spacing w:before="0" w:after="0"/>
+        <w:ind w:left="283" w:right="283"/>
+        <w:shd w:val="clear" w:color="auto" w:fill="EEF2F8"/>
+      </w:pPr>
+      <w:r>
+        <w:rPr>
+          <w:rFonts w:ascii="Courier New" w:hAnsi="Courier New"/>
+          <w:color w:val="1E3A5F"/>
+          <w:sz w:val="18"/>
+        </w:rPr>
+        <w:t xml:space="preserve">    mesh.from_pydata(verts, [], faces)</w:t>
+      </w:r>
+    </w:p>
+    <w:p>
+      <w:pPr>
+        <w:spacing w:before="0" w:after="0"/>
+        <w:ind w:left="283" w:right="283"/>
+        <w:shd w:val="clear" w:color="auto" w:fill="EEF2F8"/>
+      </w:pPr>
+      <w:r>
+        <w:rPr>
+          <w:rFonts w:ascii="Courier New" w:hAnsi="Courier New"/>
+          <w:color w:val="1E3A5F"/>
+          <w:sz w:val="18"/>
+        </w:rPr>
+        <w:t xml:space="preserve">    mesh.update()</w:t>
+      </w:r>
+    </w:p>
+    <w:p>
+      <w:pPr>
+        <w:spacing w:before="0" w:after="0"/>
+        <w:ind w:left="283" w:right="283"/>
+        <w:shd w:val="clear" w:color="auto" w:fill="EEF2F8"/>
+      </w:pPr>
+      <w:r>
+        <w:rPr>
+          <w:rFonts w:ascii="Courier New" w:hAnsi="Courier New"/>
+          <w:color w:val="1E3A5F"/>
+          <w:sz w:val="18"/>
+        </w:rPr>
+        <w:t xml:space="preserve">    return bpy.data.objects.new("MazeWalls", mesh)</w:t>
+      </w:r>
+    </w:p>
+    <w:p>
+      <w:pPr>
+        <w:spacing w:after="80"/>
+      </w:pPr>
+    </w:p>
+    <w:p>
+      <w:pPr>
+        <w:spacing w:before="60" w:after="120"/>
+        <w:ind w:firstLine="425"/>
+      </w:pPr>
+      <w:r>
+        <w:rPr>
+          <w:sz w:val="22"/>
+        </w:rPr>
+        <w:t>Запуск в headless-режиме:</w:t>
+      </w:r>
+    </w:p>
+    <w:p>
+      <w:pPr>
+        <w:spacing w:before="0" w:after="0"/>
+        <w:ind w:left="283" w:right="283"/>
+        <w:shd w:val="clear" w:color="auto" w:fill="EEF2F8"/>
+      </w:pPr>
+      <w:r>
+        <w:rPr>
+          <w:rFonts w:ascii="Courier New" w:hAnsi="Courier New"/>
+          <w:color w:val="1E3A5F"/>
+          <w:sz w:val="18"/>
+        </w:rPr>
+        <w:t>blender --background --python scripts/pathfinding/visualize_labyrinth_in_blender.py -- \</w:t>
+      </w:r>
+    </w:p>
+    <w:p>
+      <w:pPr>
+        <w:spacing w:before="0" w:after="0"/>
+        <w:ind w:left="283" w:right="283"/>
+        <w:shd w:val="clear" w:color="auto" w:fill="EEF2F8"/>
+      </w:pPr>
+      <w:r>
+        <w:rPr>
+          <w:rFonts w:ascii="Courier New" w:hAnsi="Courier New"/>
+          <w:color w:val="1E3A5F"/>
+          <w:sz w:val="18"/>
+        </w:rPr>
+        <w:t xml:space="preserve">    --rows 21 --cols 21 --seed 42 --algorithm astar \</w:t>
+      </w:r>
+    </w:p>
+    <w:p>
+      <w:pPr>
+        <w:spacing w:before="0" w:after="0"/>
+        <w:ind w:left="283" w:right="283"/>
+        <w:shd w:val="clear" w:color="auto" w:fill="EEF2F8"/>
+      </w:pPr>
+      <w:r>
+        <w:rPr>
+          <w:rFonts w:ascii="Courier New" w:hAnsi="Courier New"/>
+          <w:color w:val="1E3A5F"/>
+          <w:sz w:val="18"/>
+        </w:rPr>
+        <w:t xml:space="preserve">    --output assets/renders/labyrinth_21_astar.png</w:t>
+      </w:r>
+    </w:p>
+    <w:p>
+      <w:pPr>
+        <w:spacing w:after="80"/>
+      </w:pPr>
+    </w:p>
+    <w:p>
+      <w:pPr>
+        <w:keepNext/>
+        <w:spacing w:before="320" w:after="120"/>
+      </w:pPr>
+      <w:r>
+        <w:rPr>
+          <w:b/>
+          <w:color w:val="16213E"/>
+          <w:sz w:val="28"/>
+        </w:rPr>
+        <w:t>10.7 A* vs Dijkstra на идеальном лабиринте</w:t>
+      </w:r>
+    </w:p>
+    <w:p>
+      <w:pPr>
+        <w:spacing w:before="60" w:after="120"/>
+        <w:ind w:firstLine="425"/>
+      </w:pPr>
+      <w:r>
+        <w:rPr>
+          <w:sz w:val="22"/>
+        </w:rPr>
+        <w:t xml:space="preserve">В идеальном лабиринте между двумя клетками существует ровно один путь, поэтому </w:t>
+      </w:r>
+      <w:r>
+        <w:rPr>
+          <w:b/>
+          <w:sz w:val="22"/>
+        </w:rPr>
+        <w:t>длина маршрута у A* и Dijkstra совпадает</w:t>
+      </w:r>
+      <w:r>
+        <w:rPr>
+          <w:sz w:val="22"/>
+        </w:rPr>
+        <w:t xml:space="preserve"> — этот факт закреплён тестом test_astar_and_dijkstra_same_length_on_perfect_maze. Разница проявляется в </w:t>
+      </w:r>
+      <w:r>
+        <w:rPr>
+          <w:b/>
+          <w:sz w:val="22"/>
+        </w:rPr>
+        <w:t>числе посещённых узлов</w:t>
+      </w:r>
+      <w:r>
+        <w:rPr>
+          <w:sz w:val="22"/>
+        </w:rPr>
+        <w:t>: эвристика A* направляет поиск в сторону цели, Dijkstra же разворачивает волну во все стороны.</w:t>
+      </w:r>
+    </w:p>
+    <w:tbl>
+      <w:tblPr>
+        <w:tblStyle w:val="aff0"/>
+        <w:tblW w:type="auto" w:w="0"/>
+        <w:tblLook w:firstColumn="1" w:firstRow="1" w:lastColumn="0" w:lastRow="0" w:noHBand="0" w:noVBand="1" w:val="04A0"/>
+      </w:tblPr>
+      <w:tblGrid>
+        <w:gridCol w:w="1871"/>
+        <w:gridCol w:w="1871"/>
+        <w:gridCol w:w="1871"/>
+        <w:gridCol w:w="1871"/>
+        <w:gridCol w:w="1871"/>
+      </w:tblGrid>
+      <w:tr>
+        <w:tc>
+          <w:tcPr>
+            <w:tcW w:type="dxa" w:w="1701"/>
+            <w:shd w:val="clear" w:color="auto" w:fill="162130"/>
+            <w:vAlign w:val="center"/>
+          </w:tcPr>
+          <w:p>
+            <w:pPr>
+              <w:jc w:val="center"/>
+            </w:pPr>
+            <w:r>
+              <w:rPr>
+                <w:b/>
+                <w:color w:val="FFFFFF"/>
+                <w:sz w:val="20"/>
+              </w:rPr>
+              <w:t>Размер</w:t>
+            </w:r>
+          </w:p>
+        </w:tc>
+        <w:tc>
+          <w:tcPr>
+            <w:tcW w:type="dxa" w:w="1134"/>
+            <w:shd w:val="clear" w:color="auto" w:fill="162130"/>
+            <w:vAlign w:val="center"/>
+          </w:tcPr>
+          <w:p>
+            <w:pPr>
+              <w:jc w:val="center"/>
+            </w:pPr>
+            <w:r>
+              <w:rPr>
+                <w:b/>
+                <w:color w:val="FFFFFF"/>
+                <w:sz w:val="20"/>
+              </w:rPr>
+              <w:t>seed</w:t>
+            </w:r>
+          </w:p>
+        </w:tc>
+        <w:tc>
+          <w:tcPr>
+            <w:tcW w:type="dxa" w:w="1984"/>
+            <w:shd w:val="clear" w:color="auto" w:fill="162130"/>
+            <w:vAlign w:val="center"/>
+          </w:tcPr>
+          <w:p>
+            <w:pPr>
+              <w:jc w:val="center"/>
+            </w:pPr>
+            <w:r>
+              <w:rPr>
+                <w:b/>
+                <w:color w:val="FFFFFF"/>
+                <w:sz w:val="20"/>
+              </w:rPr>
+              <w:t>Длина пути</w:t>
+            </w:r>
+          </w:p>
+        </w:tc>
+        <w:tc>
+          <w:tcPr>
+            <w:tcW w:type="dxa" w:w="1984"/>
+            <w:shd w:val="clear" w:color="auto" w:fill="162130"/>
+            <w:vAlign w:val="center"/>
+          </w:tcPr>
+          <w:p>
+            <w:pPr>
+              <w:jc w:val="center"/>
+            </w:pPr>
+            <w:r>
+              <w:rPr>
+                <w:b/>
+                <w:color w:val="FFFFFF"/>
+                <w:sz w:val="20"/>
+              </w:rPr>
+              <w:t>A* посетил</w:t>
+            </w:r>
+          </w:p>
+        </w:tc>
+        <w:tc>
+          <w:tcPr>
+            <w:tcW w:type="dxa" w:w="1984"/>
+            <w:shd w:val="clear" w:color="auto" w:fill="162130"/>
+            <w:vAlign w:val="center"/>
+          </w:tcPr>
+          <w:p>
+            <w:pPr>
+              <w:jc w:val="center"/>
+            </w:pPr>
+            <w:r>
+              <w:rPr>
+                <w:b/>
+                <w:color w:val="FFFFFF"/>
+                <w:sz w:val="20"/>
+              </w:rPr>
+              <w:t>Dijkstra посетил</w:t>
+            </w:r>
+          </w:p>
+        </w:tc>
+      </w:tr>
+      <w:tr>
+        <w:tc>
+          <w:tcPr>
+            <w:tcW w:type="dxa" w:w="1701"/>
+            <w:shd w:val="clear" w:color="auto" w:fill="F5F7FA"/>
+            <w:vAlign w:val="center"/>
+          </w:tcPr>
+          <w:p>
+            <w:r>
+              <w:rPr>
+                <w:sz w:val="20"/>
+              </w:rPr>
+              <w:t>21×21</w:t>
+            </w:r>
+          </w:p>
+        </w:tc>
+        <w:tc>
+          <w:tcPr>
+            <w:tcW w:type="dxa" w:w="1134"/>
+            <w:shd w:val="clear" w:color="auto" w:fill="F5F7FA"/>
+            <w:vAlign w:val="center"/>
+          </w:tcPr>
+          <w:p>
+            <w:r>
+              <w:rPr>
+                <w:sz w:val="20"/>
+              </w:rPr>
+              <w:t>42</w:t>
+            </w:r>
+          </w:p>
+        </w:tc>
+        <w:tc>
+          <w:tcPr>
+            <w:tcW w:type="dxa" w:w="1984"/>
+            <w:shd w:val="clear" w:color="auto" w:fill="F5F7FA"/>
+            <w:vAlign w:val="center"/>
+          </w:tcPr>
+          <w:p>
+            <w:r>
+              <w:rPr>
+                <w:sz w:val="20"/>
+              </w:rPr>
+              <w:t>101</w:t>
+            </w:r>
+          </w:p>
+        </w:tc>
+        <w:tc>
+          <w:tcPr>
+            <w:tcW w:type="dxa" w:w="1984"/>
+            <w:shd w:val="clear" w:color="auto" w:fill="F5F7FA"/>
+            <w:vAlign w:val="center"/>
+          </w:tcPr>
+          <w:p>
+            <w:r>
+              <w:rPr>
+                <w:sz w:val="20"/>
+              </w:rPr>
+              <w:t>125</w:t>
+            </w:r>
+          </w:p>
+        </w:tc>
+        <w:tc>
+          <w:tcPr>
+            <w:tcW w:type="dxa" w:w="1984"/>
+            <w:shd w:val="clear" w:color="auto" w:fill="F5F7FA"/>
+            <w:vAlign w:val="center"/>
+          </w:tcPr>
+          <w:p>
+            <w:r>
+              <w:rPr>
+                <w:sz w:val="20"/>
+              </w:rPr>
+              <w:t>135</w:t>
+            </w:r>
+          </w:p>
+        </w:tc>
+      </w:tr>
+      <w:tr>
+        <w:tc>
+          <w:tcPr>
+            <w:tcW w:type="dxa" w:w="1701"/>
+            <w:shd w:val="clear" w:color="auto" w:fill="FFFFFF"/>
+            <w:vAlign w:val="center"/>
+          </w:tcPr>
+          <w:p>
+            <w:r>
+              <w:rPr>
+                <w:sz w:val="20"/>
+              </w:rPr>
+              <w:t>25×25</w:t>
+            </w:r>
+          </w:p>
+        </w:tc>
+        <w:tc>
+          <w:tcPr>
+            <w:tcW w:type="dxa" w:w="1134"/>
+            <w:shd w:val="clear" w:color="auto" w:fill="FFFFFF"/>
+            <w:vAlign w:val="center"/>
+          </w:tcPr>
+          <w:p>
+            <w:r>
+              <w:rPr>
+                <w:sz w:val="20"/>
+              </w:rPr>
+              <w:t>7</w:t>
+            </w:r>
+          </w:p>
+        </w:tc>
+        <w:tc>
+          <w:tcPr>
+            <w:tcW w:type="dxa" w:w="1984"/>
+            <w:shd w:val="clear" w:color="auto" w:fill="FFFFFF"/>
+            <w:vAlign w:val="center"/>
+          </w:tcPr>
+          <w:p>
+            <w:r>
+              <w:rPr>
+                <w:sz w:val="20"/>
+              </w:rPr>
+              <w:t>129</w:t>
+            </w:r>
+          </w:p>
+        </w:tc>
+        <w:tc>
+          <w:tcPr>
+            <w:tcW w:type="dxa" w:w="1984"/>
+            <w:shd w:val="clear" w:color="auto" w:fill="FFFFFF"/>
+            <w:vAlign w:val="center"/>
+          </w:tcPr>
+          <w:p>
+            <w:r>
+              <w:rPr>
+                <w:sz w:val="20"/>
+              </w:rPr>
+              <w:t>168</w:t>
+            </w:r>
+          </w:p>
+        </w:tc>
+        <w:tc>
+          <w:tcPr>
+            <w:tcW w:type="dxa" w:w="1984"/>
+            <w:shd w:val="clear" w:color="auto" w:fill="FFFFFF"/>
+            <w:vAlign w:val="center"/>
+          </w:tcPr>
+          <w:p>
+            <w:r>
+              <w:rPr>
+                <w:sz w:val="20"/>
+              </w:rPr>
+              <w:t>189</w:t>
+            </w:r>
+          </w:p>
+        </w:tc>
+      </w:tr>
+      <w:tr>
+        <w:tc>
+          <w:tcPr>
+            <w:tcW w:type="dxa" w:w="1701"/>
+            <w:shd w:val="clear" w:color="auto" w:fill="F5F7FA"/>
+            <w:vAlign w:val="center"/>
+          </w:tcPr>
+          <w:p>
+            <w:r>
+              <w:rPr>
+                <w:sz w:val="20"/>
+              </w:rPr>
+              <w:t>31×31</w:t>
+            </w:r>
+          </w:p>
+        </w:tc>
+        <w:tc>
+          <w:tcPr>
+            <w:tcW w:type="dxa" w:w="1134"/>
+            <w:shd w:val="clear" w:color="auto" w:fill="F5F7FA"/>
+            <w:vAlign w:val="center"/>
+          </w:tcPr>
+          <w:p>
+            <w:r>
+              <w:rPr>
+                <w:sz w:val="20"/>
+              </w:rPr>
+              <w:t>123</w:t>
+            </w:r>
+          </w:p>
+        </w:tc>
+        <w:tc>
+          <w:tcPr>
+            <w:tcW w:type="dxa" w:w="1984"/>
+            <w:shd w:val="clear" w:color="auto" w:fill="F5F7FA"/>
+            <w:vAlign w:val="center"/>
+          </w:tcPr>
+          <w:p>
+            <w:r>
+              <w:rPr>
+                <w:sz w:val="20"/>
+              </w:rPr>
+              <w:t>189</w:t>
+            </w:r>
+          </w:p>
+        </w:tc>
+        <w:tc>
+          <w:tcPr>
+            <w:tcW w:type="dxa" w:w="1984"/>
+            <w:shd w:val="clear" w:color="auto" w:fill="F5F7FA"/>
+            <w:vAlign w:val="center"/>
+          </w:tcPr>
+          <w:p>
+            <w:r>
+              <w:rPr>
+                <w:sz w:val="20"/>
+              </w:rPr>
+              <w:t>241</w:t>
+            </w:r>
+          </w:p>
+        </w:tc>
+        <w:tc>
+          <w:tcPr>
+            <w:tcW w:type="dxa" w:w="1984"/>
+            <w:shd w:val="clear" w:color="auto" w:fill="F5F7FA"/>
+            <w:vAlign w:val="center"/>
+          </w:tcPr>
+          <w:p>
+            <w:r>
+              <w:rPr>
+                <w:sz w:val="20"/>
+              </w:rPr>
+              <w:t>278</w:t>
+            </w:r>
+          </w:p>
+        </w:tc>
+      </w:tr>
+    </w:tbl>
+    <w:p>
+      <w:pPr>
+        <w:spacing w:after="120"/>
+      </w:pPr>
+    </w:p>
+    <w:p>
+      <w:pPr>
+        <w:spacing w:before="60" w:after="120"/>
+        <w:ind w:firstLine="425"/>
+      </w:pPr>
+      <w:r>
+        <w:rPr>
+          <w:sz w:val="22"/>
+        </w:rPr>
+        <w:t>Наблюдение: в лабиринте без циклов выигрыш A* скромный (10–20% по visited_nodes), потому что эвристика часто упирается в стену и приходится откатываться. Если «пробить» часть стен и добавить циклы — A* начнёт выигрывать сильнее. Это материал для проекта C из рабочего листа студента (docs/student_exercises.md).</w:t>
+      </w:r>
+    </w:p>
+    <w:p>
+      <w:pPr>
+        <w:keepNext/>
+        <w:spacing w:before="320" w:after="120"/>
+      </w:pPr>
+      <w:r>
+        <w:rPr>
+          <w:b/>
+          <w:color w:val="16213E"/>
+          <w:sz w:val="28"/>
+        </w:rPr>
+        <w:t>10.8 Тесты</w:t>
+      </w:r>
+    </w:p>
+    <w:p>
+      <w:pPr>
+        <w:spacing w:before="60" w:after="120"/>
+        <w:ind w:firstLine="425"/>
+      </w:pPr>
+      <w:r>
+        <w:rPr>
+          <w:sz w:val="22"/>
+        </w:rPr>
+        <w:t>Модуль покрыт 14 тестами в tests/test_labyrinth.py. Они не требуют Blender и запускаются одной командой:</w:t>
+      </w:r>
+    </w:p>
+    <w:p>
+      <w:pPr>
+        <w:spacing w:before="0" w:after="0"/>
+        <w:ind w:left="283" w:right="283"/>
+        <w:shd w:val="clear" w:color="auto" w:fill="EEF2F8"/>
+      </w:pPr>
+      <w:r>
+        <w:rPr>
+          <w:rFonts w:ascii="Courier New" w:hAnsi="Courier New"/>
+          <w:color w:val="1E3A5F"/>
+          <w:sz w:val="18"/>
+        </w:rPr>
+        <w:t>python -m unittest tests.test_labyrinth -v</w:t>
+      </w:r>
+    </w:p>
+    <w:p>
+      <w:pPr>
+        <w:spacing w:after="80"/>
+      </w:pPr>
+    </w:p>
+    <w:tbl>
+      <w:tblPr>
+        <w:tblStyle w:val="aff0"/>
+        <w:tblW w:type="auto" w:w="0"/>
+        <w:tblLook w:firstColumn="1" w:firstRow="1" w:lastColumn="0" w:lastRow="0" w:noHBand="0" w:noVBand="1" w:val="04A0"/>
+      </w:tblPr>
+      <w:tblGrid>
+        <w:gridCol w:w="4677"/>
+        <w:gridCol w:w="4677"/>
+      </w:tblGrid>
+      <w:tr>
+        <w:tc>
+          <w:tcPr>
+            <w:tcW w:type="dxa" w:w="2268"/>
+            <w:shd w:val="clear" w:color="auto" w:fill="162130"/>
+            <w:vAlign w:val="center"/>
+          </w:tcPr>
+          <w:p>
+            <w:pPr>
+              <w:jc w:val="center"/>
+            </w:pPr>
+            <w:r>
+              <w:rPr>
+                <w:b/>
+                <w:color w:val="FFFFFF"/>
+                <w:sz w:val="20"/>
+              </w:rPr>
+              <w:t>Группа</w:t>
+            </w:r>
+          </w:p>
+        </w:tc>
+        <w:tc>
+          <w:tcPr>
+            <w:tcW w:type="dxa" w:w="6803"/>
+            <w:shd w:val="clear" w:color="auto" w:fill="162130"/>
+            <w:vAlign w:val="center"/>
+          </w:tcPr>
+          <w:p>
+            <w:pPr>
+              <w:jc w:val="center"/>
+            </w:pPr>
+            <w:r>
+              <w:rPr>
+                <w:b/>
+                <w:color w:val="FFFFFF"/>
+                <w:sz w:val="20"/>
+              </w:rPr>
+              <w:t>Что проверяется</w:t>
+            </w:r>
+          </w:p>
+        </w:tc>
+      </w:tr>
+      <w:tr>
+        <w:tc>
+          <w:tcPr>
+            <w:tcW w:type="dxa" w:w="2268"/>
+            <w:shd w:val="clear" w:color="auto" w:fill="F5F7FA"/>
+            <w:vAlign w:val="center"/>
+          </w:tcPr>
+          <w:p>
+            <w:r>
+              <w:rPr>
+                <w:sz w:val="20"/>
+              </w:rPr>
+              <w:t>Генерация</w:t>
+            </w:r>
+          </w:p>
+        </w:tc>
+        <w:tc>
+          <w:tcPr>
+            <w:tcW w:type="dxa" w:w="6803"/>
+            <w:shd w:val="clear" w:color="auto" w:fill="F5F7FA"/>
+            <w:vAlign w:val="center"/>
+          </w:tcPr>
+          <w:p>
+            <w:r>
+              <w:rPr>
+                <w:sz w:val="20"/>
+              </w:rPr>
+              <w:t>Воспроизводимость seed, чётные→нечётные размеры, границы всегда стены</w:t>
+            </w:r>
+          </w:p>
+        </w:tc>
+      </w:tr>
+      <w:tr>
+        <w:tc>
+          <w:tcPr>
+            <w:tcW w:type="dxa" w:w="2268"/>
+            <w:shd w:val="clear" w:color="auto" w:fill="FFFFFF"/>
+            <w:vAlign w:val="center"/>
+          </w:tcPr>
+          <w:p>
+            <w:r>
+              <w:rPr>
+                <w:sz w:val="20"/>
+              </w:rPr>
+              <w:t>Формат</w:t>
+            </w:r>
+          </w:p>
+        </w:tc>
+        <w:tc>
+          <w:tcPr>
+            <w:tcW w:type="dxa" w:w="6803"/>
+            <w:shd w:val="clear" w:color="auto" w:fill="FFFFFF"/>
+            <w:vAlign w:val="center"/>
+          </w:tcPr>
+          <w:p>
+            <w:r>
+              <w:rPr>
+                <w:sz w:val="20"/>
+              </w:rPr>
+              <w:t>В ячейках только 0/1, start и goal всегда свободны</w:t>
+            </w:r>
+          </w:p>
+        </w:tc>
+      </w:tr>
+      <w:tr>
+        <w:tc>
+          <w:tcPr>
+            <w:tcW w:type="dxa" w:w="2268"/>
+            <w:shd w:val="clear" w:color="auto" w:fill="F5F7FA"/>
+            <w:vAlign w:val="center"/>
+          </w:tcPr>
+          <w:p>
+            <w:r>
+              <w:rPr>
+                <w:sz w:val="20"/>
+              </w:rPr>
+              <w:t>Поиск</w:t>
+            </w:r>
+          </w:p>
+        </w:tc>
+        <w:tc>
+          <w:tcPr>
+            <w:tcW w:type="dxa" w:w="6803"/>
+            <w:shd w:val="clear" w:color="auto" w:fill="F5F7FA"/>
+            <w:vAlign w:val="center"/>
+          </w:tcPr>
+          <w:p>
+            <w:r>
+              <w:rPr>
+                <w:sz w:val="20"/>
+              </w:rPr>
+              <w:t>A* и Dijkstra находят путь, path идёт только по свободным клеткам</w:t>
+            </w:r>
+          </w:p>
+        </w:tc>
+      </w:tr>
+      <w:tr>
+        <w:tc>
+          <w:tcPr>
+            <w:tcW w:type="dxa" w:w="2268"/>
+            <w:shd w:val="clear" w:color="auto" w:fill="FFFFFF"/>
+            <w:vAlign w:val="center"/>
+          </w:tcPr>
+          <w:p>
+            <w:r>
+              <w:rPr>
+                <w:sz w:val="20"/>
+              </w:rPr>
+              <w:t>Смежность</w:t>
+            </w:r>
+          </w:p>
+        </w:tc>
+        <w:tc>
+          <w:tcPr>
+            <w:tcW w:type="dxa" w:w="6803"/>
+            <w:shd w:val="clear" w:color="auto" w:fill="FFFFFF"/>
+            <w:vAlign w:val="center"/>
+          </w:tcPr>
+          <w:p>
+            <w:r>
+              <w:rPr>
+                <w:sz w:val="20"/>
+              </w:rPr>
+              <w:t>Каждый следующий шаг пути — сосед предыдущего (4-связность)</w:t>
+            </w:r>
+          </w:p>
+        </w:tc>
+      </w:tr>
+      <w:tr>
+        <w:tc>
+          <w:tcPr>
+            <w:tcW w:type="dxa" w:w="2268"/>
+            <w:shd w:val="clear" w:color="auto" w:fill="F5F7FA"/>
+            <w:vAlign w:val="center"/>
+          </w:tcPr>
+          <w:p>
+            <w:r>
+              <w:rPr>
+                <w:sz w:val="20"/>
+              </w:rPr>
+              <w:t>Эквивалентность</w:t>
+            </w:r>
+          </w:p>
+        </w:tc>
+        <w:tc>
+          <w:tcPr>
+            <w:tcW w:type="dxa" w:w="6803"/>
+            <w:shd w:val="clear" w:color="auto" w:fill="F5F7FA"/>
+            <w:vAlign w:val="center"/>
+          </w:tcPr>
+          <w:p>
+            <w:r>
+              <w:rPr>
+                <w:sz w:val="20"/>
+              </w:rPr>
+              <w:t>На идеальном лабиринте длина пути A* = длина пути Dijkstra</w:t>
+            </w:r>
+          </w:p>
+        </w:tc>
+      </w:tr>
+      <w:tr>
+        <w:tc>
+          <w:tcPr>
+            <w:tcW w:type="dxa" w:w="2268"/>
+            <w:shd w:val="clear" w:color="auto" w:fill="FFFFFF"/>
+            <w:vAlign w:val="center"/>
+          </w:tcPr>
+          <w:p>
+            <w:r>
+              <w:rPr>
+                <w:sz w:val="20"/>
+              </w:rPr>
+              <w:t>Конвертация</w:t>
+            </w:r>
+          </w:p>
+        </w:tc>
+        <w:tc>
+          <w:tcPr>
+            <w:tcW w:type="dxa" w:w="6803"/>
+            <w:shd w:val="clear" w:color="auto" w:fill="FFFFFF"/>
+            <w:vAlign w:val="center"/>
+          </w:tcPr>
+          <w:p>
+            <w:r>
+              <w:rPr>
+                <w:sz w:val="20"/>
+              </w:rPr>
+              <w:t>maze_path_to_scene_points даёт координаты с правильным шагом cell_size</w:t>
+            </w:r>
+          </w:p>
+        </w:tc>
+      </w:tr>
+    </w:tbl>
+    <w:p>
+      <w:pPr>
+        <w:spacing w:after="120"/>
+      </w:pPr>
+    </w:p>
+    <w:p>
+      <w:pPr>
+        <w:keepNext/>
+        <w:spacing w:before="320" w:after="120"/>
+      </w:pPr>
+      <w:r>
+        <w:rPr>
+          <w:b/>
+          <w:color w:val="16213E"/>
+          <w:sz w:val="28"/>
+        </w:rPr>
+        <w:t>10.9 Что дальше</w:t>
+      </w:r>
+    </w:p>
+    <w:p>
+      <w:pPr>
+        <w:pStyle w:val="a0"/>
+        <w:spacing w:before="40" w:after="40"/>
+        <w:ind w:left="425"/>
+      </w:pPr>
+      <w:r>
+        <w:rPr>
+          <w:sz w:val="22"/>
+        </w:rPr>
+        <w:t>Добавить «дорогие» ячейки (не стены, а высокая стоимость) и показать, как w_risk влияет на маршрут.</w:t>
+      </w:r>
+    </w:p>
+    <w:p>
+      <w:pPr>
+        <w:pStyle w:val="a0"/>
+        <w:spacing w:before="40" w:after="40"/>
+        <w:ind w:left="425"/>
+      </w:pPr>
+      <w:r>
+        <w:rPr>
+          <w:sz w:val="22"/>
+        </w:rPr>
+        <w:t>Сгенерировать лабиринт с циклами (убрать часть стен после DFS) — и показать, что A* начнёт заметно выигрывать по visited_nodes.</w:t>
+      </w:r>
+    </w:p>
+    <w:p>
+      <w:pPr>
+        <w:pStyle w:val="a0"/>
+        <w:spacing w:before="40" w:after="40"/>
+        <w:ind w:left="425"/>
+      </w:pPr>
+      <w:r>
+        <w:rPr>
+          <w:sz w:val="22"/>
+        </w:rPr>
+        <w:t>Анимация пошагового поиска: сохранять visited_nodes на каждом шаге и запекать keyframes в Blender.</w:t>
+      </w:r>
+    </w:p>
+    <w:p>
+      <w:pPr>
+        <w:pStyle w:val="a0"/>
+        <w:spacing w:before="40" w:after="40"/>
+        <w:ind w:left="425"/>
+      </w:pPr>
+      <w:r>
+        <w:rPr>
+          <w:sz w:val="22"/>
+        </w:rPr>
+        <w:t>Скрестить лабиринт и рельеф: пустить путь по лабиринту, у которого стены — холмы на поверхности z=f(x,y).</w:t>
+      </w:r>
+    </w:p>
+    <w:p>
+      <w:r>
+        <w:br w:type="page"/>
       </w:r>
     </w:p>
     <w:sectPr>

</xml_diff>